<commit_message>
add temp _prediction.m; debug task2; finish task3
</commit_message>
<xml_diff>
--- a/CW2/MATLAB Coursework 2  Word Template.docx
+++ b/CW2/MATLAB Coursework 2  Word Template.docx
@@ -8,7 +8,7 @@
     <w:p/>
     <w:p>
       <w:pPr>
-        <w:pStyle w:val="Title"/>
+        <w:pStyle w:val="a8"/>
       </w:pPr>
       <w:r>
         <w:t>AERO1005 MATLAB Coursework 2</w:t>
@@ -100,19 +100,425 @@
     </w:p>
     <w:p>
       <w:pPr>
+        <w:rPr>
+          <w:rFonts w:hint="eastAsia"/>
+          <w:color w:val="808080" w:themeColor="background1" w:themeShade="80"/>
+          <w:lang w:eastAsia="zh-CN"/>
+        </w:rPr>
+      </w:pPr>
+      <w:r>
+        <w:rPr>
+          <w:color w:val="808080" w:themeColor="background1" w:themeShade="80"/>
+          <w:lang w:eastAsia="zh-CN"/>
+        </w:rPr>
+        <w:t>T</w:t>
+      </w:r>
+      <w:r>
+        <w:rPr>
+          <w:rFonts w:hint="eastAsia"/>
+          <w:color w:val="808080" w:themeColor="background1" w:themeShade="80"/>
+          <w:lang w:eastAsia="zh-CN"/>
+        </w:rPr>
+        <w:t>ask1</w:t>
+      </w:r>
+    </w:p>
+    <w:p>
+      <w:pPr>
         <w:spacing w:line="259" w:lineRule="auto"/>
         <w:jc w:val="both"/>
         <w:rPr>
-          <w:color w:val="000000" w:themeColor="text1"/>
-          <w:highlight w:val="cyan"/>
+          <w:rFonts w:hint="eastAsia"/>
+          <w:color w:val="000000" w:themeColor="text1"/>
+          <w:highlight w:val="cyan"/>
+          <w:lang w:eastAsia="zh-CN"/>
+        </w:rPr>
+      </w:pPr>
+      <w:r>
+        <w:rPr>
+          <w:noProof/>
+        </w:rPr>
+        <w:drawing>
+          <wp:inline distT="0" distB="0" distL="0" distR="0" wp14:anchorId="157C4080" wp14:editId="013DD48F">
+            <wp:extent cx="2362200" cy="2542433"/>
+            <wp:effectExtent l="0" t="0" r="0" b="0"/>
+            <wp:docPr id="351247395" name="图片 3"/>
+            <wp:cNvGraphicFramePr>
+              <a:graphicFrameLocks xmlns:a="http://schemas.openxmlformats.org/drawingml/2006/main" noChangeAspect="1"/>
+            </wp:cNvGraphicFramePr>
+            <a:graphic xmlns:a="http://schemas.openxmlformats.org/drawingml/2006/main">
+              <a:graphicData uri="http://schemas.openxmlformats.org/drawingml/2006/picture">
+                <pic:pic xmlns:pic="http://schemas.openxmlformats.org/drawingml/2006/picture">
+                  <pic:nvPicPr>
+                    <pic:cNvPr id="0" name="Picture 1"/>
+                    <pic:cNvPicPr>
+                      <a:picLocks noChangeAspect="1" noChangeArrowheads="1"/>
+                    </pic:cNvPicPr>
+                  </pic:nvPicPr>
+                  <pic:blipFill>
+                    <a:blip r:embed="rId8" cstate="print">
+                      <a:extLst>
+                        <a:ext uri="{28A0092B-C50C-407E-A947-70E740481C1C}">
+                          <a14:useLocalDpi xmlns:a14="http://schemas.microsoft.com/office/drawing/2010/main" val="0"/>
+                        </a:ext>
+                      </a:extLst>
+                    </a:blip>
+                    <a:srcRect/>
+                    <a:stretch>
+                      <a:fillRect/>
+                    </a:stretch>
+                  </pic:blipFill>
+                  <pic:spPr bwMode="auto">
+                    <a:xfrm>
+                      <a:off x="0" y="0"/>
+                      <a:ext cx="2363855" cy="2544214"/>
+                    </a:xfrm>
+                    <a:prstGeom prst="rect">
+                      <a:avLst/>
+                    </a:prstGeom>
+                    <a:noFill/>
+                    <a:ln>
+                      <a:noFill/>
+                    </a:ln>
+                  </pic:spPr>
+                </pic:pic>
+              </a:graphicData>
+            </a:graphic>
+          </wp:inline>
+        </w:drawing>
+      </w:r>
+    </w:p>
+    <w:p>
+      <w:pPr>
+        <w:spacing w:line="259" w:lineRule="auto"/>
+        <w:jc w:val="both"/>
+        <w:rPr>
+          <w:color w:val="000000" w:themeColor="text1"/>
+          <w:highlight w:val="cyan"/>
+          <w:lang w:eastAsia="zh-CN"/>
+        </w:rPr>
+      </w:pPr>
+      <w:r>
+        <w:rPr>
+          <w:color w:val="000000" w:themeColor="text1"/>
+          <w:highlight w:val="cyan"/>
+          <w:lang w:eastAsia="zh-CN"/>
+        </w:rPr>
+        <w:t>T</w:t>
+      </w:r>
+      <w:r>
+        <w:rPr>
+          <w:rFonts w:hint="eastAsia"/>
+          <w:color w:val="000000" w:themeColor="text1"/>
+          <w:highlight w:val="cyan"/>
+          <w:lang w:eastAsia="zh-CN"/>
+        </w:rPr>
+        <w:t>ask2</w:t>
+      </w:r>
+    </w:p>
+    <w:p>
+      <w:pPr>
+        <w:spacing w:line="259" w:lineRule="auto"/>
+        <w:jc w:val="both"/>
+        <w:rPr>
+          <w:color w:val="000000" w:themeColor="text1"/>
+          <w:highlight w:val="cyan"/>
+          <w:lang w:eastAsia="zh-CN"/>
+        </w:rPr>
+      </w:pPr>
+      <w:r>
+        <w:rPr>
+          <w:noProof/>
+          <w:color w:val="000000" w:themeColor="text1"/>
+          <w:lang w:eastAsia="zh-CN"/>
+        </w:rPr>
+        <w:drawing>
+          <wp:inline distT="0" distB="0" distL="0" distR="0" wp14:anchorId="1DBDCA4D" wp14:editId="26113C94">
+            <wp:extent cx="3180205" cy="4241800"/>
+            <wp:effectExtent l="0" t="0" r="1270" b="6350"/>
+            <wp:docPr id="1679888415" name="图片 5"/>
+            <wp:cNvGraphicFramePr>
+              <a:graphicFrameLocks xmlns:a="http://schemas.openxmlformats.org/drawingml/2006/main" noChangeAspect="1"/>
+            </wp:cNvGraphicFramePr>
+            <a:graphic xmlns:a="http://schemas.openxmlformats.org/drawingml/2006/main">
+              <a:graphicData uri="http://schemas.openxmlformats.org/drawingml/2006/picture">
+                <pic:pic xmlns:pic="http://schemas.openxmlformats.org/drawingml/2006/picture">
+                  <pic:nvPicPr>
+                    <pic:cNvPr id="0" name="Picture 12"/>
+                    <pic:cNvPicPr>
+                      <a:picLocks noChangeAspect="1" noChangeArrowheads="1"/>
+                    </pic:cNvPicPr>
+                  </pic:nvPicPr>
+                  <pic:blipFill>
+                    <a:blip r:embed="rId9" cstate="print">
+                      <a:extLst>
+                        <a:ext uri="{28A0092B-C50C-407E-A947-70E740481C1C}">
+                          <a14:useLocalDpi xmlns:a14="http://schemas.microsoft.com/office/drawing/2010/main" val="0"/>
+                        </a:ext>
+                      </a:extLst>
+                    </a:blip>
+                    <a:srcRect/>
+                    <a:stretch>
+                      <a:fillRect/>
+                    </a:stretch>
+                  </pic:blipFill>
+                  <pic:spPr bwMode="auto">
+                    <a:xfrm>
+                      <a:off x="0" y="0"/>
+                      <a:ext cx="3183160" cy="4245742"/>
+                    </a:xfrm>
+                    <a:prstGeom prst="rect">
+                      <a:avLst/>
+                    </a:prstGeom>
+                    <a:noFill/>
+                    <a:ln>
+                      <a:noFill/>
+                    </a:ln>
+                  </pic:spPr>
+                </pic:pic>
+              </a:graphicData>
+            </a:graphic>
+          </wp:inline>
+        </w:drawing>
+      </w:r>
+    </w:p>
+    <w:p>
+      <w:pPr>
+        <w:spacing w:line="259" w:lineRule="auto"/>
+        <w:jc w:val="both"/>
+        <w:rPr>
+          <w:color w:val="000000" w:themeColor="text1"/>
+          <w:highlight w:val="cyan"/>
+          <w:lang w:eastAsia="zh-CN"/>
+        </w:rPr>
+      </w:pPr>
+    </w:p>
+    <w:p>
+      <w:pPr>
+        <w:spacing w:line="259" w:lineRule="auto"/>
+        <w:jc w:val="both"/>
+        <w:rPr>
+          <w:rFonts w:hint="eastAsia"/>
+          <w:color w:val="000000" w:themeColor="text1"/>
+          <w:highlight w:val="cyan"/>
+          <w:lang w:eastAsia="zh-CN"/>
+        </w:rPr>
+      </w:pPr>
+      <w:r>
+        <w:rPr>
+          <w:color w:val="000000" w:themeColor="text1"/>
+          <w:highlight w:val="cyan"/>
+          <w:lang w:eastAsia="zh-CN"/>
+        </w:rPr>
+        <w:t>T</w:t>
+      </w:r>
+      <w:r>
+        <w:rPr>
+          <w:rFonts w:hint="eastAsia"/>
+          <w:color w:val="000000" w:themeColor="text1"/>
+          <w:highlight w:val="cyan"/>
+          <w:lang w:eastAsia="zh-CN"/>
+        </w:rPr>
+        <w:t>ask3</w:t>
+      </w:r>
+    </w:p>
+    <w:p>
+      <w:pPr>
+        <w:spacing w:line="259" w:lineRule="auto"/>
+        <w:jc w:val="both"/>
+        <w:rPr>
+          <w:color w:val="000000" w:themeColor="text1"/>
+          <w:highlight w:val="cyan"/>
+          <w:lang w:val="en-US" w:eastAsia="zh-CN"/>
+        </w:rPr>
+      </w:pPr>
+      <w:r>
+        <w:rPr>
+          <w:b/>
+          <w:bCs/>
+          <w:color w:val="000000" w:themeColor="text1"/>
+          <w:highlight w:val="cyan"/>
+          <w:lang w:val="en-US" w:eastAsia="zh-CN"/>
+        </w:rPr>
+        <w:t>Reflective Statement</w:t>
+      </w:r>
+    </w:p>
+    <w:p>
+      <w:pPr>
+        <w:spacing w:line="259" w:lineRule="auto"/>
+        <w:jc w:val="both"/>
+        <w:rPr>
+          <w:color w:val="000000" w:themeColor="text1"/>
+          <w:highlight w:val="cyan"/>
+          <w:lang w:val="en-US" w:eastAsia="zh-CN"/>
+        </w:rPr>
+      </w:pPr>
+      <w:r>
+        <w:rPr>
+          <w:b/>
+          <w:bCs/>
+          <w:color w:val="000000" w:themeColor="text1"/>
+          <w:highlight w:val="cyan"/>
+          <w:lang w:val="en-US" w:eastAsia="zh-CN"/>
+        </w:rPr>
+        <w:lastRenderedPageBreak/>
+        <w:t>Challenges:</w:t>
+      </w:r>
+      <w:r>
+        <w:rPr>
+          <w:color w:val="000000" w:themeColor="text1"/>
+          <w:highlight w:val="cyan"/>
+          <w:lang w:val="en-US" w:eastAsia="zh-CN"/>
+        </w:rPr>
+        <w:br/>
+        <w:t>The most significant challenge in this project was implementing the non-blocking infinite loop for Task 2. Initially, using the </w:t>
+      </w:r>
+      <w:proofErr w:type="gramStart"/>
+      <w:r>
+        <w:rPr>
+          <w:color w:val="000000" w:themeColor="text1"/>
+          <w:highlight w:val="cyan"/>
+          <w:lang w:val="en-US" w:eastAsia="zh-CN"/>
+        </w:rPr>
+        <w:t>pause(</w:t>
+      </w:r>
+      <w:proofErr w:type="gramEnd"/>
+      <w:r>
+        <w:rPr>
+          <w:color w:val="000000" w:themeColor="text1"/>
+          <w:highlight w:val="cyan"/>
+          <w:lang w:val="en-US" w:eastAsia="zh-CN"/>
+        </w:rPr>
+        <w:t>) command to control the LED blinking sequence caused the entire program to halt, delaying the temperature sampling interval and freezing the live graph. Another challenge emerged in Task 3, where raw temperature differentials between consecutive seconds were too erratic due to analog sensor noise, causing the LEDs to trigger incorrectly.</w:t>
+      </w:r>
+    </w:p>
+    <w:p>
+      <w:pPr>
+        <w:spacing w:line="259" w:lineRule="auto"/>
+        <w:jc w:val="both"/>
+        <w:rPr>
+          <w:color w:val="000000" w:themeColor="text1"/>
+          <w:highlight w:val="cyan"/>
+          <w:lang w:val="en-US" w:eastAsia="zh-CN"/>
+        </w:rPr>
+      </w:pPr>
+      <w:r>
+        <w:rPr>
+          <w:b/>
+          <w:bCs/>
+          <w:color w:val="000000" w:themeColor="text1"/>
+          <w:highlight w:val="cyan"/>
+          <w:lang w:val="en-US" w:eastAsia="zh-CN"/>
+        </w:rPr>
+        <w:t>Strengths:</w:t>
+      </w:r>
+      <w:r>
+        <w:rPr>
+          <w:color w:val="000000" w:themeColor="text1"/>
+          <w:highlight w:val="cyan"/>
+          <w:lang w:val="en-US" w:eastAsia="zh-CN"/>
+        </w:rPr>
+        <w:br/>
+        <w:t>To overcome the blocking issue, a robust non-blocking timer was successfully developed using MATLAB's tic and toc functions. By applying the modulo operation (mod) to the elapsed time, the LEDs could blink asynchronously without interrupting the 1-second temperature sampling. Additionally, to address the sensor noise in Task 3, a 10-second sliding window algorithm was implemented. This successfully smoothed the data, allowing for accurate and stable calculation of the temperature derivative (rate of change) and reliable 5-minute predictions.</w:t>
+      </w:r>
+    </w:p>
+    <w:p>
+      <w:pPr>
+        <w:spacing w:line="259" w:lineRule="auto"/>
+        <w:jc w:val="both"/>
+        <w:rPr>
+          <w:color w:val="000000" w:themeColor="text1"/>
+          <w:highlight w:val="cyan"/>
+          <w:lang w:val="en-US" w:eastAsia="zh-CN"/>
+        </w:rPr>
+      </w:pPr>
+      <w:r>
+        <w:rPr>
+          <w:b/>
+          <w:bCs/>
+          <w:color w:val="000000" w:themeColor="text1"/>
+          <w:highlight w:val="cyan"/>
+          <w:lang w:val="en-US" w:eastAsia="zh-CN"/>
+        </w:rPr>
+        <w:t>Limitations:</w:t>
+      </w:r>
+      <w:r>
+        <w:rPr>
+          <w:color w:val="000000" w:themeColor="text1"/>
+          <w:highlight w:val="cyan"/>
+          <w:lang w:val="en-US" w:eastAsia="zh-CN"/>
+        </w:rPr>
+        <w:br/>
+        <w:t>The prediction algorithm assumes that the rate of temperature change remains strictly linear and constant over a 5-minute period. In real thermodynamic systems, temperature changes often follow exponential or logarithmic curves, meaning the current linear extrapolation could overestimate the final temperature. Furthermore, the MCP9700A analog thermistor has inherent electrical noise, limiting the ultimate precision of the readings compared to digital counterparts.</w:t>
+      </w:r>
+    </w:p>
+    <w:p>
+      <w:pPr>
+        <w:spacing w:line="259" w:lineRule="auto"/>
+        <w:jc w:val="both"/>
+        <w:rPr>
+          <w:color w:val="000000" w:themeColor="text1"/>
+          <w:highlight w:val="cyan"/>
+          <w:lang w:val="en-US" w:eastAsia="zh-CN"/>
+        </w:rPr>
+      </w:pPr>
+      <w:r>
+        <w:rPr>
+          <w:b/>
+          <w:bCs/>
+          <w:color w:val="000000" w:themeColor="text1"/>
+          <w:highlight w:val="cyan"/>
+          <w:lang w:val="en-US" w:eastAsia="zh-CN"/>
+        </w:rPr>
+        <w:t>Suggested Future Improvements:</w:t>
+      </w:r>
+      <w:r>
+        <w:rPr>
+          <w:color w:val="000000" w:themeColor="text1"/>
+          <w:highlight w:val="cyan"/>
+          <w:lang w:val="en-US" w:eastAsia="zh-CN"/>
+        </w:rPr>
+        <w:br/>
+        <w:t>For future iterations, replacing the analog thermistor with a high-precision digital sensor (such as the DS18B20) would significantly reduce signal noise. Moreover, instead of a simple linear extrapolation, advanced algorithms like a Kalman Filter or exponential smoothing could be introduced to predict future temperatures more accurately. Finally, implementing a PID (Proportional-Integral-Derivative) controller algorithm in the code would allow the system to actively regulate a cooling/heating mechanism, rather than simply triggering passive visual alarms.</w:t>
+      </w:r>
+    </w:p>
+    <w:p>
+      <w:pPr>
+        <w:spacing w:line="259" w:lineRule="auto"/>
+        <w:jc w:val="both"/>
+        <w:rPr>
+          <w:color w:val="000000" w:themeColor="text1"/>
+          <w:highlight w:val="cyan"/>
+          <w:lang w:val="en-US" w:eastAsia="zh-CN"/>
+        </w:rPr>
+      </w:pPr>
+      <w:r>
+        <w:rPr>
+          <w:color w:val="000000" w:themeColor="text1"/>
+          <w:highlight w:val="cyan"/>
+          <w:lang w:val="en-US" w:eastAsia="zh-CN"/>
+        </w:rPr>
+        <w:pict w14:anchorId="6A05A942">
+          <v:rect id="_x0000_i1033" style="width:730.65pt;height:1.5pt" o:hrpct="0" o:hralign="center" o:hrstd="t" o:hr="t" fillcolor="#a0a0a0" stroked="f"/>
+        </w:pict>
+      </w:r>
+    </w:p>
+    <w:p>
+      <w:pPr>
+        <w:spacing w:line="259" w:lineRule="auto"/>
+        <w:jc w:val="both"/>
+        <w:rPr>
+          <w:rFonts w:hint="eastAsia"/>
+          <w:color w:val="000000" w:themeColor="text1"/>
+          <w:highlight w:val="cyan"/>
+          <w:lang w:eastAsia="zh-CN"/>
         </w:rPr>
       </w:pPr>
     </w:p>
     <w:sectPr>
-      <w:headerReference w:type="default" r:id="rId8"/>
-      <w:footerReference w:type="default" r:id="rId9"/>
-      <w:headerReference w:type="first" r:id="rId10"/>
-      <w:footerReference w:type="first" r:id="rId11"/>
+      <w:headerReference w:type="default" r:id="rId10"/>
+      <w:footerReference w:type="default" r:id="rId11"/>
+      <w:headerReference w:type="first" r:id="rId12"/>
+      <w:footerReference w:type="first" r:id="rId13"/>
       <w:pgSz w:w="11906" w:h="16838"/>
       <w:pgMar w:top="1440" w:right="1440" w:bottom="1440" w:left="1440" w:header="850" w:footer="708" w:gutter="0"/>
       <w:cols w:space="708"/>
@@ -167,7 +573,7 @@
     <w:sdtContent>
       <w:p>
         <w:pPr>
-          <w:pStyle w:val="Footer"/>
+          <w:pStyle w:val="a6"/>
           <w:jc w:val="right"/>
         </w:pPr>
         <w:r>
@@ -226,7 +632,7 @@
             </mc:Choice>
             <mc:Fallback>
               <w:pict>
-                <v:line w14:anchorId="68CAF598" id="Straight Connector 4" o:spid="_x0000_s1026" style="position:absolute;z-index:251658243;visibility:visible;mso-wrap-style:square;mso-wrap-distance-left:9pt;mso-wrap-distance-top:0;mso-wrap-distance-right:9pt;mso-wrap-distance-bottom:0;mso-position-horizontal:absolute;mso-position-horizontal-relative:text;mso-position-vertical:absolute;mso-position-vertical-relative:text" from="-.75pt,-10.2pt" to="454.5pt,-10.2pt" o:gfxdata="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" strokecolor="#4472c4 [3204]" strokeweight=".5pt">
+                <v:line w14:anchorId="58087435" id="Straight Connector 4" o:spid="_x0000_s1026" style="position:absolute;z-index:251658243;visibility:visible;mso-wrap-style:square;mso-wrap-distance-left:9pt;mso-wrap-distance-top:0;mso-wrap-distance-right:9pt;mso-wrap-distance-bottom:0;mso-position-horizontal:absolute;mso-position-horizontal-relative:text;mso-position-vertical:absolute;mso-position-vertical-relative:text" from="-.75pt,-10.2pt" to="454.5pt,-10.2pt" o:gfxdata="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" strokecolor="#4472c4 [3204]" strokeweight=".5pt">
                   <v:stroke joinstyle="miter"/>
                 </v:line>
               </w:pict>
@@ -259,7 +665,7 @@
   </w:sdt>
   <w:p>
     <w:pPr>
-      <w:pStyle w:val="Footer"/>
+      <w:pStyle w:val="a6"/>
       <w:rPr>
         <w:i/>
         <w:iCs/>
@@ -304,13 +710,13 @@
 <w:ftr xmlns:wpc="http://schemas.microsoft.com/office/word/2010/wordprocessingCanvas" xmlns:cx="http://schemas.microsoft.com/office/drawing/2014/chartex" xmlns:cx1="http://schemas.microsoft.com/office/drawing/2015/9/8/chartex" xmlns:cx2="http://schemas.microsoft.com/office/drawing/2015/10/21/chartex" xmlns:cx3="http://schemas.microsoft.com/office/drawing/2016/5/9/chartex" xmlns:cx4="http://schemas.microsoft.com/office/drawing/2016/5/10/chartex" xmlns:cx5="http://schemas.microsoft.com/office/drawing/2016/5/11/chartex" xmlns:cx6="http://schemas.microsoft.com/office/drawing/2016/5/12/chartex" xmlns:cx7="http://schemas.microsoft.com/office/drawing/2016/5/13/chartex" xmlns:cx8="http://schemas.microsoft.com/office/drawing/2016/5/14/chartex" xmlns:mc="http://schemas.openxmlformats.org/markup-compatibility/2006" xmlns:aink="http://schemas.microsoft.com/office/drawing/2016/ink" xmlns:am3d="http://schemas.microsoft.com/office/drawing/2017/model3d" xmlns:o="urn:schemas-microsoft-com:office:office" xmlns:oel="http://schemas.microsoft.com/office/2019/extlst" xmlns:r="http://schemas.openxmlformats.org/officeDocument/2006/relationships" xmlns:m="http://schemas.openxmlformats.org/officeDocument/2006/math" xmlns:v="urn:schemas-microsoft-com:vml" xmlns:wp14="http://schemas.microsoft.com/office/word/2010/wordprocessingDrawing" xmlns:wp="http://schemas.openxmlformats.org/drawingml/2006/wordprocessingDrawing" xmlns:w10="urn:schemas-microsoft-com:office:word" xmlns:w="http://schemas.openxmlformats.org/wordprocessingml/2006/main" xmlns:w14="http://schemas.microsoft.com/office/word/2010/wordml" xmlns:w15="http://schemas.microsoft.com/office/word/2012/wordml" xmlns:w16cex="http://schemas.microsoft.com/office/word/2018/wordml/cex" xmlns:w16cid="http://schemas.microsoft.com/office/word/2016/wordml/cid" xmlns:w16="http://schemas.microsoft.com/office/word/2018/wordml" xmlns:w16du="http://schemas.microsoft.com/office/word/2023/wordml/word16du" xmlns:w16sdtdh="http://schemas.microsoft.com/office/word/2020/wordml/sdtdatahash" xmlns:w16sdtfl="http://schemas.microsoft.com/office/word/2024/wordml/sdtformatlock" xmlns:w16se="http://schemas.microsoft.com/office/word/2015/wordml/symex" xmlns:wpg="http://schemas.microsoft.com/office/word/2010/wordprocessingGroup" xmlns:wpi="http://schemas.microsoft.com/office/word/2010/wordprocessingInk" xmlns:wne="http://schemas.microsoft.com/office/word/2006/wordml" xmlns:wps="http://schemas.microsoft.com/office/word/2010/wordprocessingShape" mc:Ignorable="w14 w15 w16se w16cid w16 w16cex w16sdtdh w16sdtfl w16du wp14">
   <w:p>
     <w:pPr>
-      <w:pStyle w:val="Footer"/>
+      <w:pStyle w:val="a6"/>
       <w:jc w:val="right"/>
     </w:pPr>
   </w:p>
   <w:p>
     <w:pPr>
-      <w:pStyle w:val="Footer"/>
+      <w:pStyle w:val="a6"/>
     </w:pPr>
   </w:p>
 </w:ftr>
@@ -346,7 +752,7 @@
 <w:hdr xmlns:wpc="http://schemas.microsoft.com/office/word/2010/wordprocessingCanvas" xmlns:cx="http://schemas.microsoft.com/office/drawing/2014/chartex" xmlns:cx1="http://schemas.microsoft.com/office/drawing/2015/9/8/chartex" xmlns:cx2="http://schemas.microsoft.com/office/drawing/2015/10/21/chartex" xmlns:cx3="http://schemas.microsoft.com/office/drawing/2016/5/9/chartex" xmlns:cx4="http://schemas.microsoft.com/office/drawing/2016/5/10/chartex" xmlns:cx5="http://schemas.microsoft.com/office/drawing/2016/5/11/chartex" xmlns:cx6="http://schemas.microsoft.com/office/drawing/2016/5/12/chartex" xmlns:cx7="http://schemas.microsoft.com/office/drawing/2016/5/13/chartex" xmlns:cx8="http://schemas.microsoft.com/office/drawing/2016/5/14/chartex" xmlns:mc="http://schemas.openxmlformats.org/markup-compatibility/2006" xmlns:aink="http://schemas.microsoft.com/office/drawing/2016/ink" xmlns:am3d="http://schemas.microsoft.com/office/drawing/2017/model3d" xmlns:o="urn:schemas-microsoft-com:office:office" xmlns:oel="http://schemas.microsoft.com/office/2019/extlst" xmlns:r="http://schemas.openxmlformats.org/officeDocument/2006/relationships" xmlns:m="http://schemas.openxmlformats.org/officeDocument/2006/math" xmlns:v="urn:schemas-microsoft-com:vml" xmlns:wp14="http://schemas.microsoft.com/office/word/2010/wordprocessingDrawing" xmlns:wp="http://schemas.openxmlformats.org/drawingml/2006/wordprocessingDrawing" xmlns:w10="urn:schemas-microsoft-com:office:word" xmlns:w="http://schemas.openxmlformats.org/wordprocessingml/2006/main" xmlns:w14="http://schemas.microsoft.com/office/word/2010/wordml" xmlns:w15="http://schemas.microsoft.com/office/word/2012/wordml" xmlns:w16cex="http://schemas.microsoft.com/office/word/2018/wordml/cex" xmlns:w16cid="http://schemas.microsoft.com/office/word/2016/wordml/cid" xmlns:w16="http://schemas.microsoft.com/office/word/2018/wordml" xmlns:w16du="http://schemas.microsoft.com/office/word/2023/wordml/word16du" xmlns:w16sdtdh="http://schemas.microsoft.com/office/word/2020/wordml/sdtdatahash" xmlns:w16sdtfl="http://schemas.microsoft.com/office/word/2024/wordml/sdtformatlock" xmlns:w16se="http://schemas.microsoft.com/office/word/2015/wordml/symex" xmlns:wpg="http://schemas.microsoft.com/office/word/2010/wordprocessingGroup" xmlns:wpi="http://schemas.microsoft.com/office/word/2010/wordprocessingInk" xmlns:wne="http://schemas.microsoft.com/office/word/2006/wordml" xmlns:wps="http://schemas.microsoft.com/office/word/2010/wordprocessingShape" mc:Ignorable="w14 w15 w16se w16cid w16 w16cex w16sdtdh w16sdtfl w16du wp14">
   <w:p>
     <w:pPr>
-      <w:pStyle w:val="Header"/>
+      <w:pStyle w:val="a4"/>
       <w:rPr>
         <w:i/>
         <w:iCs/>
@@ -373,7 +779,7 @@
 <w:hdr xmlns:wpc="http://schemas.microsoft.com/office/word/2010/wordprocessingCanvas" xmlns:cx="http://schemas.microsoft.com/office/drawing/2014/chartex" xmlns:cx1="http://schemas.microsoft.com/office/drawing/2015/9/8/chartex" xmlns:cx2="http://schemas.microsoft.com/office/drawing/2015/10/21/chartex" xmlns:cx3="http://schemas.microsoft.com/office/drawing/2016/5/9/chartex" xmlns:cx4="http://schemas.microsoft.com/office/drawing/2016/5/10/chartex" xmlns:cx5="http://schemas.microsoft.com/office/drawing/2016/5/11/chartex" xmlns:cx6="http://schemas.microsoft.com/office/drawing/2016/5/12/chartex" xmlns:cx7="http://schemas.microsoft.com/office/drawing/2016/5/13/chartex" xmlns:cx8="http://schemas.microsoft.com/office/drawing/2016/5/14/chartex" xmlns:mc="http://schemas.openxmlformats.org/markup-compatibility/2006" xmlns:aink="http://schemas.microsoft.com/office/drawing/2016/ink" xmlns:am3d="http://schemas.microsoft.com/office/drawing/2017/model3d" xmlns:o="urn:schemas-microsoft-com:office:office" xmlns:oel="http://schemas.microsoft.com/office/2019/extlst" xmlns:r="http://schemas.openxmlformats.org/officeDocument/2006/relationships" xmlns:m="http://schemas.openxmlformats.org/officeDocument/2006/math" xmlns:v="urn:schemas-microsoft-com:vml" xmlns:wp14="http://schemas.microsoft.com/office/word/2010/wordprocessingDrawing" xmlns:wp="http://schemas.openxmlformats.org/drawingml/2006/wordprocessingDrawing" xmlns:w10="urn:schemas-microsoft-com:office:word" xmlns:w="http://schemas.openxmlformats.org/wordprocessingml/2006/main" xmlns:w14="http://schemas.microsoft.com/office/word/2010/wordml" xmlns:w15="http://schemas.microsoft.com/office/word/2012/wordml" xmlns:w16cex="http://schemas.microsoft.com/office/word/2018/wordml/cex" xmlns:w16cid="http://schemas.microsoft.com/office/word/2016/wordml/cid" xmlns:w16="http://schemas.microsoft.com/office/word/2018/wordml" xmlns:w16du="http://schemas.microsoft.com/office/word/2023/wordml/word16du" xmlns:w16sdtdh="http://schemas.microsoft.com/office/word/2020/wordml/sdtdatahash" xmlns:w16sdtfl="http://schemas.microsoft.com/office/word/2024/wordml/sdtformatlock" xmlns:w16se="http://schemas.microsoft.com/office/word/2015/wordml/symex" xmlns:wpg="http://schemas.microsoft.com/office/word/2010/wordprocessingGroup" xmlns:wpi="http://schemas.microsoft.com/office/word/2010/wordprocessingInk" xmlns:wne="http://schemas.microsoft.com/office/word/2006/wordml" xmlns:wps="http://schemas.microsoft.com/office/word/2010/wordprocessingShape" mc:Ignorable="w14 w15 w16se w16cid w16 w16cex w16sdtdh w16sdtfl w16du wp14">
   <w:p>
     <w:pPr>
-      <w:pStyle w:val="Header"/>
+      <w:pStyle w:val="a4"/>
     </w:pPr>
     <w:r>
       <w:rPr>
@@ -648,7 +1054,7 @@
     <w:lvl w:ilvl="0">
       <w:start w:val="1"/>
       <w:numFmt w:val="decimal"/>
-      <w:pStyle w:val="Heading1"/>
+      <w:pStyle w:val="1"/>
       <w:lvlText w:val="%1."/>
       <w:lvlJc w:val="left"/>
       <w:pPr>
@@ -658,7 +1064,7 @@
     <w:lvl w:ilvl="1">
       <w:start w:val="1"/>
       <w:numFmt w:val="decimal"/>
-      <w:pStyle w:val="Heading2"/>
+      <w:pStyle w:val="2"/>
       <w:lvlText w:val="%1.%2."/>
       <w:lvlJc w:val="left"/>
       <w:pPr>
@@ -975,7 +1381,7 @@
   <w:docDefaults>
     <w:rPrDefault>
       <w:rPr>
-        <w:rFonts w:asciiTheme="minorHAnsi" w:eastAsiaTheme="minorHAnsi" w:hAnsiTheme="minorHAnsi" w:cstheme="minorBidi"/>
+        <w:rFonts w:asciiTheme="minorHAnsi" w:eastAsia="宋体" w:hAnsiTheme="minorHAnsi" w:cstheme="minorBidi"/>
         <w:sz w:val="22"/>
         <w:szCs w:val="22"/>
         <w:lang w:val="en-GB" w:eastAsia="en-US" w:bidi="ar-SA"/>
@@ -1365,7 +1771,7 @@
     <w:lsdException w:name="Unresolved Mention" w:semiHidden="1" w:unhideWhenUsed="1"/>
     <w:lsdException w:name="Smart Link" w:semiHidden="1" w:unhideWhenUsed="1"/>
   </w:latentStyles>
-  <w:style w:type="paragraph" w:default="1" w:styleId="Normal">
+  <w:style w:type="paragraph" w:default="1" w:styleId="a">
     <w:name w:val="Normal"/>
     <w:qFormat/>
     <w:rsid w:val="005072DF"/>
@@ -1376,11 +1782,11 @@
       <w:rFonts w:ascii="Arial" w:hAnsi="Arial" w:cs="Arial"/>
     </w:rPr>
   </w:style>
-  <w:style w:type="paragraph" w:styleId="Heading1">
+  <w:style w:type="paragraph" w:styleId="1">
     <w:name w:val="heading 1"/>
-    <w:basedOn w:val="ListParagraph"/>
-    <w:next w:val="Normal"/>
-    <w:link w:val="Heading1Char"/>
+    <w:basedOn w:val="a0"/>
+    <w:next w:val="a"/>
+    <w:link w:val="10"/>
     <w:uiPriority w:val="9"/>
     <w:qFormat/>
     <w:rsid w:val="001F5F3A"/>
@@ -1399,11 +1805,11 @@
       <w:szCs w:val="28"/>
     </w:rPr>
   </w:style>
-  <w:style w:type="paragraph" w:styleId="Heading2">
+  <w:style w:type="paragraph" w:styleId="2">
     <w:name w:val="heading 2"/>
-    <w:basedOn w:val="Heading1"/>
-    <w:next w:val="Normal"/>
-    <w:link w:val="Heading2Char"/>
+    <w:basedOn w:val="1"/>
+    <w:next w:val="a"/>
+    <w:link w:val="20"/>
     <w:uiPriority w:val="9"/>
     <w:unhideWhenUsed/>
     <w:qFormat/>
@@ -1421,13 +1827,12 @@
       <w:szCs w:val="22"/>
     </w:rPr>
   </w:style>
-  <w:style w:type="character" w:default="1" w:styleId="DefaultParagraphFont">
+  <w:style w:type="character" w:default="1" w:styleId="a1">
     <w:name w:val="Default Paragraph Font"/>
     <w:uiPriority w:val="1"/>
-    <w:semiHidden/>
     <w:unhideWhenUsed/>
   </w:style>
-  <w:style w:type="table" w:default="1" w:styleId="TableNormal">
+  <w:style w:type="table" w:default="1" w:styleId="a2">
     <w:name w:val="Normal Table"/>
     <w:uiPriority w:val="99"/>
     <w:semiHidden/>
@@ -1442,16 +1847,16 @@
       </w:tblCellMar>
     </w:tblPr>
   </w:style>
-  <w:style w:type="numbering" w:default="1" w:styleId="NoList">
+  <w:style w:type="numbering" w:default="1" w:styleId="a3">
     <w:name w:val="No List"/>
     <w:uiPriority w:val="99"/>
     <w:semiHidden/>
     <w:unhideWhenUsed/>
   </w:style>
-  <w:style w:type="paragraph" w:styleId="Header">
+  <w:style w:type="paragraph" w:styleId="a4">
     <w:name w:val="header"/>
-    <w:basedOn w:val="Normal"/>
-    <w:link w:val="HeaderChar"/>
+    <w:basedOn w:val="a"/>
+    <w:link w:val="a5"/>
     <w:uiPriority w:val="99"/>
     <w:unhideWhenUsed/>
     <w:rsid w:val="00A864C2"/>
@@ -1463,17 +1868,17 @@
       <w:spacing w:after="0" w:line="240" w:lineRule="auto"/>
     </w:pPr>
   </w:style>
-  <w:style w:type="character" w:customStyle="1" w:styleId="HeaderChar">
-    <w:name w:val="Header Char"/>
-    <w:basedOn w:val="DefaultParagraphFont"/>
-    <w:link w:val="Header"/>
+  <w:style w:type="character" w:customStyle="1" w:styleId="a5">
+    <w:name w:val="页眉 字符"/>
+    <w:basedOn w:val="a1"/>
+    <w:link w:val="a4"/>
     <w:uiPriority w:val="99"/>
     <w:rsid w:val="00A864C2"/>
   </w:style>
-  <w:style w:type="paragraph" w:styleId="Footer">
+  <w:style w:type="paragraph" w:styleId="a6">
     <w:name w:val="footer"/>
-    <w:basedOn w:val="Normal"/>
-    <w:link w:val="FooterChar"/>
+    <w:basedOn w:val="a"/>
+    <w:link w:val="a7"/>
     <w:uiPriority w:val="99"/>
     <w:unhideWhenUsed/>
     <w:rsid w:val="00A864C2"/>
@@ -1485,18 +1890,18 @@
       <w:spacing w:after="0" w:line="240" w:lineRule="auto"/>
     </w:pPr>
   </w:style>
-  <w:style w:type="character" w:customStyle="1" w:styleId="FooterChar">
-    <w:name w:val="Footer Char"/>
-    <w:basedOn w:val="DefaultParagraphFont"/>
-    <w:link w:val="Footer"/>
+  <w:style w:type="character" w:customStyle="1" w:styleId="a7">
+    <w:name w:val="页脚 字符"/>
+    <w:basedOn w:val="a1"/>
+    <w:link w:val="a6"/>
     <w:uiPriority w:val="99"/>
     <w:rsid w:val="00A864C2"/>
   </w:style>
-  <w:style w:type="paragraph" w:styleId="Title">
+  <w:style w:type="paragraph" w:styleId="a8">
     <w:name w:val="Title"/>
-    <w:basedOn w:val="Normal"/>
-    <w:next w:val="Normal"/>
-    <w:link w:val="TitleChar"/>
+    <w:basedOn w:val="a"/>
+    <w:next w:val="a"/>
+    <w:link w:val="a9"/>
     <w:uiPriority w:val="10"/>
     <w:qFormat/>
     <w:rsid w:val="00470AA9"/>
@@ -1510,10 +1915,10 @@
       <w:szCs w:val="28"/>
     </w:rPr>
   </w:style>
-  <w:style w:type="character" w:customStyle="1" w:styleId="TitleChar">
-    <w:name w:val="Title Char"/>
-    <w:basedOn w:val="DefaultParagraphFont"/>
-    <w:link w:val="Title"/>
+  <w:style w:type="character" w:customStyle="1" w:styleId="a9">
+    <w:name w:val="标题 字符"/>
+    <w:basedOn w:val="a1"/>
+    <w:link w:val="a8"/>
     <w:uiPriority w:val="10"/>
     <w:rsid w:val="00470AA9"/>
     <w:rPr>
@@ -1524,9 +1929,9 @@
       <w:szCs w:val="28"/>
     </w:rPr>
   </w:style>
-  <w:style w:type="table" w:styleId="TableGrid">
+  <w:style w:type="table" w:styleId="aa">
     <w:name w:val="Table Grid"/>
-    <w:basedOn w:val="TableNormal"/>
+    <w:basedOn w:val="a2"/>
     <w:uiPriority w:val="39"/>
     <w:rsid w:val="005072DF"/>
     <w:pPr>
@@ -1543,9 +1948,9 @@
       </w:tblBorders>
     </w:tblPr>
   </w:style>
-  <w:style w:type="character" w:styleId="PlaceholderText">
+  <w:style w:type="character" w:styleId="ab">
     <w:name w:val="Placeholder Text"/>
-    <w:basedOn w:val="DefaultParagraphFont"/>
+    <w:basedOn w:val="a1"/>
     <w:uiPriority w:val="99"/>
     <w:semiHidden/>
     <w:rsid w:val="005072DF"/>
@@ -1553,9 +1958,9 @@
       <w:color w:val="808080"/>
     </w:rPr>
   </w:style>
-  <w:style w:type="paragraph" w:styleId="ListParagraph">
+  <w:style w:type="paragraph" w:styleId="a0">
     <w:name w:val="List Paragraph"/>
-    <w:basedOn w:val="Normal"/>
+    <w:basedOn w:val="a"/>
     <w:uiPriority w:val="34"/>
     <w:qFormat/>
     <w:rsid w:val="00470AA9"/>
@@ -1564,10 +1969,10 @@
       <w:contextualSpacing/>
     </w:pPr>
   </w:style>
-  <w:style w:type="character" w:customStyle="1" w:styleId="Heading1Char">
-    <w:name w:val="Heading 1 Char"/>
-    <w:basedOn w:val="DefaultParagraphFont"/>
-    <w:link w:val="Heading1"/>
+  <w:style w:type="character" w:customStyle="1" w:styleId="10">
+    <w:name w:val="标题 1 字符"/>
+    <w:basedOn w:val="a1"/>
+    <w:link w:val="1"/>
     <w:uiPriority w:val="9"/>
     <w:rsid w:val="001F5F3A"/>
     <w:rPr>
@@ -1578,10 +1983,10 @@
       <w:szCs w:val="28"/>
     </w:rPr>
   </w:style>
-  <w:style w:type="character" w:customStyle="1" w:styleId="Heading2Char">
-    <w:name w:val="Heading 2 Char"/>
-    <w:basedOn w:val="DefaultParagraphFont"/>
-    <w:link w:val="Heading2"/>
+  <w:style w:type="character" w:customStyle="1" w:styleId="20">
+    <w:name w:val="标题 2 字符"/>
+    <w:basedOn w:val="a1"/>
+    <w:link w:val="2"/>
     <w:uiPriority w:val="9"/>
     <w:rsid w:val="00ED034F"/>
     <w:rPr>
@@ -1590,10 +1995,10 @@
       <w:bCs/>
     </w:rPr>
   </w:style>
-  <w:style w:type="paragraph" w:styleId="Caption">
+  <w:style w:type="paragraph" w:styleId="ac">
     <w:name w:val="caption"/>
-    <w:basedOn w:val="Normal"/>
-    <w:next w:val="Normal"/>
+    <w:basedOn w:val="a"/>
+    <w:next w:val="a"/>
     <w:uiPriority w:val="35"/>
     <w:unhideWhenUsed/>
     <w:qFormat/>
@@ -1608,10 +2013,10 @@
       <w:color w:val="44546A" w:themeColor="text2"/>
     </w:rPr>
   </w:style>
-  <w:style w:type="paragraph" w:styleId="TOCHeading">
+  <w:style w:type="paragraph" w:styleId="TOC">
     <w:name w:val="TOC Heading"/>
-    <w:basedOn w:val="Heading1"/>
-    <w:next w:val="Normal"/>
+    <w:basedOn w:val="1"/>
+    <w:next w:val="a"/>
     <w:uiPriority w:val="39"/>
     <w:unhideWhenUsed/>
     <w:qFormat/>
@@ -1638,8 +2043,8 @@
   </w:style>
   <w:style w:type="paragraph" w:styleId="TOC1">
     <w:name w:val="toc 1"/>
-    <w:basedOn w:val="Normal"/>
-    <w:next w:val="Normal"/>
+    <w:basedOn w:val="a"/>
+    <w:next w:val="a"/>
     <w:autoRedefine/>
     <w:uiPriority w:val="39"/>
     <w:unhideWhenUsed/>
@@ -1650,8 +2055,8 @@
   </w:style>
   <w:style w:type="paragraph" w:styleId="TOC2">
     <w:name w:val="toc 2"/>
-    <w:basedOn w:val="Normal"/>
-    <w:next w:val="Normal"/>
+    <w:basedOn w:val="a"/>
+    <w:next w:val="a"/>
     <w:autoRedefine/>
     <w:uiPriority w:val="39"/>
     <w:unhideWhenUsed/>
@@ -1661,9 +2066,9 @@
       <w:ind w:left="220"/>
     </w:pPr>
   </w:style>
-  <w:style w:type="character" w:styleId="Hyperlink">
+  <w:style w:type="character" w:styleId="ad">
     <w:name w:val="Hyperlink"/>
-    <w:basedOn w:val="DefaultParagraphFont"/>
+    <w:basedOn w:val="a1"/>
     <w:uiPriority w:val="99"/>
     <w:unhideWhenUsed/>
     <w:rsid w:val="00AF5424"/>
@@ -1672,17 +2077,17 @@
       <w:u w:val="single"/>
     </w:rPr>
   </w:style>
-  <w:style w:type="paragraph" w:styleId="Bibliography">
+  <w:style w:type="paragraph" w:styleId="ae">
     <w:name w:val="Bibliography"/>
-    <w:basedOn w:val="Normal"/>
-    <w:next w:val="Normal"/>
+    <w:basedOn w:val="a"/>
+    <w:next w:val="a"/>
     <w:uiPriority w:val="37"/>
     <w:unhideWhenUsed/>
     <w:rsid w:val="00CA7DEA"/>
   </w:style>
-  <w:style w:type="character" w:styleId="Emphasis">
+  <w:style w:type="character" w:styleId="af">
     <w:name w:val="Emphasis"/>
-    <w:basedOn w:val="DefaultParagraphFont"/>
+    <w:basedOn w:val="a1"/>
     <w:uiPriority w:val="20"/>
     <w:qFormat/>
     <w:rsid w:val="000A7D3A"/>
@@ -1691,9 +2096,9 @@
       <w:iCs/>
     </w:rPr>
   </w:style>
-  <w:style w:type="character" w:styleId="IntenseEmphasis">
+  <w:style w:type="character" w:styleId="af0">
     <w:name w:val="Intense Emphasis"/>
-    <w:basedOn w:val="DefaultParagraphFont"/>
+    <w:basedOn w:val="a1"/>
     <w:uiPriority w:val="21"/>
     <w:qFormat/>
     <w:rsid w:val="000A7D3A"/>

</xml_diff>

<commit_message>
debug task3; add flow chart to doc file; refine annotation
</commit_message>
<xml_diff>
--- a/CW2/MATLAB Coursework 2  Word Template.docx
+++ b/CW2/MATLAB Coursework 2  Word Template.docx
@@ -18,8 +18,10 @@
     <w:p>
       <w:pPr>
         <w:rPr>
+          <w:rFonts w:hint="eastAsia"/>
           <w:b/>
           <w:bCs/>
+          <w:lang w:eastAsia="zh-CN"/>
         </w:rPr>
       </w:pPr>
       <w:r>
@@ -27,14 +29,36 @@
           <w:b/>
           <w:bCs/>
         </w:rPr>
-        <w:t>Author: Add your name</w:t>
+        <w:t xml:space="preserve">Author: </w:t>
+      </w:r>
+      <w:proofErr w:type="spellStart"/>
+      <w:r>
+        <w:rPr>
+          <w:rFonts w:hint="eastAsia"/>
+          <w:b/>
+          <w:bCs/>
+          <w:lang w:eastAsia="zh-CN"/>
+        </w:rPr>
+        <w:t>Jiekai</w:t>
+      </w:r>
+      <w:proofErr w:type="spellEnd"/>
+      <w:r>
+        <w:rPr>
+          <w:rFonts w:hint="eastAsia"/>
+          <w:b/>
+          <w:bCs/>
+          <w:lang w:eastAsia="zh-CN"/>
+        </w:rPr>
+        <w:t xml:space="preserve"> Song</w:t>
       </w:r>
     </w:p>
     <w:p>
       <w:pPr>
         <w:rPr>
+          <w:rFonts w:hint="eastAsia"/>
           <w:b/>
           <w:bCs/>
+          <w:lang w:eastAsia="zh-CN"/>
         </w:rPr>
       </w:pPr>
       <w:r>
@@ -42,14 +66,25 @@
           <w:b/>
           <w:bCs/>
         </w:rPr>
-        <w:t>Student ID: Put your ID number here</w:t>
+        <w:t xml:space="preserve">Student ID: </w:t>
+      </w:r>
+      <w:r>
+        <w:rPr>
+          <w:rFonts w:hint="eastAsia"/>
+          <w:b/>
+          <w:bCs/>
+          <w:lang w:eastAsia="zh-CN"/>
+        </w:rPr>
+        <w:t>20717659</w:t>
       </w:r>
     </w:p>
     <w:p>
       <w:pPr>
         <w:rPr>
+          <w:rFonts w:hint="eastAsia"/>
           <w:b/>
           <w:bCs/>
+          <w:lang w:eastAsia="zh-CN"/>
         </w:rPr>
       </w:pPr>
       <w:r>
@@ -61,10 +96,12 @@
       </w:r>
       <w:r>
         <w:rPr>
+          <w:rFonts w:hint="eastAsia"/>
           <w:b/>
           <w:bCs/>
-        </w:rPr>
-        <w:t>Add submission date here</w:t>
+          <w:lang w:eastAsia="zh-CN"/>
+        </w:rPr>
+        <w:t>2026/05/03</w:t>
       </w:r>
     </w:p>
     <w:p/>
@@ -125,7 +162,7 @@
     <w:p>
       <w:pPr>
         <w:spacing w:line="259" w:lineRule="auto"/>
-        <w:jc w:val="both"/>
+        <w:jc w:val="center"/>
         <w:rPr>
           <w:rFonts w:hint="eastAsia"/>
           <w:color w:val="000000" w:themeColor="text1"/>
@@ -138,8 +175,8 @@
           <w:noProof/>
         </w:rPr>
         <w:drawing>
-          <wp:inline distT="0" distB="0" distL="0" distR="0" wp14:anchorId="157C4080" wp14:editId="013DD48F">
-            <wp:extent cx="2362200" cy="2542433"/>
+          <wp:inline distT="0" distB="0" distL="0" distR="0" wp14:anchorId="157C4080" wp14:editId="11E2FAFD">
+            <wp:extent cx="3132820" cy="3371850"/>
             <wp:effectExtent l="0" t="0" r="0" b="0"/>
             <wp:docPr id="351247395" name="图片 3"/>
             <wp:cNvGraphicFramePr>
@@ -170,7 +207,7 @@
                   <pic:spPr bwMode="auto">
                     <a:xfrm>
                       <a:off x="0" y="0"/>
-                      <a:ext cx="2363855" cy="2544214"/>
+                      <a:ext cx="3142018" cy="3381750"/>
                     </a:xfrm>
                     <a:prstGeom prst="rect">
                       <a:avLst/>
@@ -193,14 +230,12 @@
         <w:jc w:val="both"/>
         <w:rPr>
           <w:color w:val="000000" w:themeColor="text1"/>
-          <w:highlight w:val="cyan"/>
           <w:lang w:eastAsia="zh-CN"/>
         </w:rPr>
       </w:pPr>
       <w:r>
         <w:rPr>
           <w:color w:val="000000" w:themeColor="text1"/>
-          <w:highlight w:val="cyan"/>
           <w:lang w:eastAsia="zh-CN"/>
         </w:rPr>
         <w:t>T</w:t>
@@ -209,7 +244,6 @@
         <w:rPr>
           <w:rFonts w:hint="eastAsia"/>
           <w:color w:val="000000" w:themeColor="text1"/>
-          <w:highlight w:val="cyan"/>
           <w:lang w:eastAsia="zh-CN"/>
         </w:rPr>
         <w:t>ask2</w:t>
@@ -218,7 +252,7 @@
     <w:p>
       <w:pPr>
         <w:spacing w:line="259" w:lineRule="auto"/>
-        <w:jc w:val="both"/>
+        <w:jc w:val="center"/>
         <w:rPr>
           <w:color w:val="000000" w:themeColor="text1"/>
           <w:highlight w:val="cyan"/>
@@ -284,137 +318,299 @@
     <w:p>
       <w:pPr>
         <w:spacing w:line="259" w:lineRule="auto"/>
-        <w:jc w:val="both"/>
+        <w:jc w:val="center"/>
         <w:rPr>
           <w:color w:val="000000" w:themeColor="text1"/>
           <w:highlight w:val="cyan"/>
           <w:lang w:eastAsia="zh-CN"/>
         </w:rPr>
       </w:pPr>
+      <w:r>
+        <w:rPr>
+          <w:noProof/>
+          <w:color w:val="000000" w:themeColor="text1"/>
+          <w:lang w:eastAsia="zh-CN"/>
+        </w:rPr>
+        <w:lastRenderedPageBreak/>
+        <w:drawing>
+          <wp:inline distT="0" distB="0" distL="0" distR="0" wp14:anchorId="5CE3DE6D" wp14:editId="1A855716">
+            <wp:extent cx="3970364" cy="6485182"/>
+            <wp:effectExtent l="0" t="0" r="0" b="0"/>
+            <wp:docPr id="1557954237" name="图片 8"/>
+            <wp:cNvGraphicFramePr>
+              <a:graphicFrameLocks xmlns:a="http://schemas.openxmlformats.org/drawingml/2006/main" noChangeAspect="1"/>
+            </wp:cNvGraphicFramePr>
+            <a:graphic xmlns:a="http://schemas.openxmlformats.org/drawingml/2006/main">
+              <a:graphicData uri="http://schemas.openxmlformats.org/drawingml/2006/picture">
+                <pic:pic xmlns:pic="http://schemas.openxmlformats.org/drawingml/2006/picture">
+                  <pic:nvPicPr>
+                    <pic:cNvPr id="1557954237" name="图片 1557954237"/>
+                    <pic:cNvPicPr/>
+                  </pic:nvPicPr>
+                  <pic:blipFill>
+                    <a:blip r:embed="rId10">
+                      <a:extLst>
+                        <a:ext uri="{28A0092B-C50C-407E-A947-70E740481C1C}">
+                          <a14:useLocalDpi xmlns:a14="http://schemas.microsoft.com/office/drawing/2010/main" val="0"/>
+                        </a:ext>
+                      </a:extLst>
+                    </a:blip>
+                    <a:stretch>
+                      <a:fillRect/>
+                    </a:stretch>
+                  </pic:blipFill>
+                  <pic:spPr>
+                    <a:xfrm>
+                      <a:off x="0" y="0"/>
+                      <a:ext cx="3970364" cy="6485182"/>
+                    </a:xfrm>
+                    <a:prstGeom prst="rect">
+                      <a:avLst/>
+                    </a:prstGeom>
+                  </pic:spPr>
+                </pic:pic>
+              </a:graphicData>
+            </a:graphic>
+          </wp:inline>
+        </w:drawing>
+      </w:r>
+      <w:r>
+        <w:rPr>
+          <w:noProof/>
+          <w:color w:val="000000" w:themeColor="text1"/>
+          <w:lang w:eastAsia="zh-CN"/>
+        </w:rPr>
+        <w:lastRenderedPageBreak/>
+        <w:drawing>
+          <wp:inline distT="0" distB="0" distL="0" distR="0" wp14:anchorId="3EF5394F" wp14:editId="67ACB523">
+            <wp:extent cx="5731510" cy="6740525"/>
+            <wp:effectExtent l="0" t="0" r="2540" b="3175"/>
+            <wp:docPr id="1634973931" name="图片 9"/>
+            <wp:cNvGraphicFramePr>
+              <a:graphicFrameLocks xmlns:a="http://schemas.openxmlformats.org/drawingml/2006/main" noChangeAspect="1"/>
+            </wp:cNvGraphicFramePr>
+            <a:graphic xmlns:a="http://schemas.openxmlformats.org/drawingml/2006/main">
+              <a:graphicData uri="http://schemas.openxmlformats.org/drawingml/2006/picture">
+                <pic:pic xmlns:pic="http://schemas.openxmlformats.org/drawingml/2006/picture">
+                  <pic:nvPicPr>
+                    <pic:cNvPr id="1634973931" name="图片 1634973931"/>
+                    <pic:cNvPicPr/>
+                  </pic:nvPicPr>
+                  <pic:blipFill>
+                    <a:blip r:embed="rId11">
+                      <a:extLst>
+                        <a:ext uri="{28A0092B-C50C-407E-A947-70E740481C1C}">
+                          <a14:useLocalDpi xmlns:a14="http://schemas.microsoft.com/office/drawing/2010/main" val="0"/>
+                        </a:ext>
+                      </a:extLst>
+                    </a:blip>
+                    <a:stretch>
+                      <a:fillRect/>
+                    </a:stretch>
+                  </pic:blipFill>
+                  <pic:spPr>
+                    <a:xfrm>
+                      <a:off x="0" y="0"/>
+                      <a:ext cx="5731510" cy="6740525"/>
+                    </a:xfrm>
+                    <a:prstGeom prst="rect">
+                      <a:avLst/>
+                    </a:prstGeom>
+                  </pic:spPr>
+                </pic:pic>
+              </a:graphicData>
+            </a:graphic>
+          </wp:inline>
+        </w:drawing>
+      </w:r>
     </w:p>
     <w:p>
       <w:pPr>
         <w:spacing w:line="259" w:lineRule="auto"/>
         <w:jc w:val="both"/>
         <w:rPr>
-          <w:rFonts w:hint="eastAsia"/>
-          <w:color w:val="000000" w:themeColor="text1"/>
-          <w:highlight w:val="cyan"/>
-          <w:lang w:eastAsia="zh-CN"/>
-        </w:rPr>
-      </w:pPr>
-      <w:r>
-        <w:rPr>
-          <w:color w:val="000000" w:themeColor="text1"/>
-          <w:highlight w:val="cyan"/>
-          <w:lang w:eastAsia="zh-CN"/>
-        </w:rPr>
-        <w:t>T</w:t>
-      </w:r>
-      <w:r>
-        <w:rPr>
-          <w:rFonts w:hint="eastAsia"/>
-          <w:color w:val="000000" w:themeColor="text1"/>
-          <w:highlight w:val="cyan"/>
-          <w:lang w:eastAsia="zh-CN"/>
-        </w:rPr>
-        <w:t>ask3</w:t>
-      </w:r>
+          <w:b/>
+          <w:bCs/>
+          <w:color w:val="000000" w:themeColor="text1"/>
+          <w:lang w:val="en-US" w:eastAsia="zh-CN"/>
+        </w:rPr>
+      </w:pPr>
     </w:p>
     <w:p>
       <w:pPr>
         <w:spacing w:line="259" w:lineRule="auto"/>
         <w:jc w:val="both"/>
         <w:rPr>
-          <w:color w:val="000000" w:themeColor="text1"/>
-          <w:highlight w:val="cyan"/>
-          <w:lang w:val="en-US" w:eastAsia="zh-CN"/>
-        </w:rPr>
-      </w:pPr>
-      <w:r>
-        <w:rPr>
           <w:b/>
           <w:bCs/>
           <w:color w:val="000000" w:themeColor="text1"/>
-          <w:highlight w:val="cyan"/>
           <w:lang w:val="en-US" w:eastAsia="zh-CN"/>
         </w:rPr>
-        <w:t>Reflective Statement</w:t>
-      </w:r>
+      </w:pPr>
     </w:p>
     <w:p>
       <w:pPr>
         <w:spacing w:line="259" w:lineRule="auto"/>
         <w:jc w:val="both"/>
         <w:rPr>
-          <w:color w:val="000000" w:themeColor="text1"/>
-          <w:highlight w:val="cyan"/>
-          <w:lang w:val="en-US" w:eastAsia="zh-CN"/>
-        </w:rPr>
-      </w:pPr>
-      <w:r>
-        <w:rPr>
           <w:b/>
           <w:bCs/>
           <w:color w:val="000000" w:themeColor="text1"/>
-          <w:highlight w:val="cyan"/>
           <w:lang w:val="en-US" w:eastAsia="zh-CN"/>
         </w:rPr>
-        <w:lastRenderedPageBreak/>
-        <w:t>Challenges:</w:t>
-      </w:r>
-      <w:r>
-        <w:rPr>
-          <w:color w:val="000000" w:themeColor="text1"/>
-          <w:highlight w:val="cyan"/>
+      </w:pPr>
+      <w:r>
+        <w:rPr>
+          <w:rFonts w:hint="eastAsia"/>
+          <w:b/>
+          <w:bCs/>
+          <w:color w:val="000000" w:themeColor="text1"/>
           <w:lang w:val="en-US" w:eastAsia="zh-CN"/>
         </w:rPr>
-        <w:br/>
-        <w:t>The most significant challenge in this project was implementing the non-blocking infinite loop for Task 2. Initially, using the </w:t>
-      </w:r>
-      <w:proofErr w:type="gramStart"/>
-      <w:r>
-        <w:rPr>
-          <w:color w:val="000000" w:themeColor="text1"/>
-          <w:highlight w:val="cyan"/>
-          <w:lang w:val="en-US" w:eastAsia="zh-CN"/>
-        </w:rPr>
-        <w:t>pause(</w:t>
-      </w:r>
-      <w:proofErr w:type="gramEnd"/>
-      <w:r>
-        <w:rPr>
-          <w:color w:val="000000" w:themeColor="text1"/>
-          <w:highlight w:val="cyan"/>
-          <w:lang w:val="en-US" w:eastAsia="zh-CN"/>
-        </w:rPr>
-        <w:t>) command to control the LED blinking sequence caused the entire program to halt, delaying the temperature sampling interval and freezing the live graph. Another challenge emerged in Task 3, where raw temperature differentials between consecutive seconds were too erratic due to analog sensor noise, causing the LEDs to trigger incorrectly.</w:t>
+        <w:t>Task3:</w:t>
       </w:r>
     </w:p>
     <w:p>
       <w:pPr>
         <w:spacing w:line="259" w:lineRule="auto"/>
-        <w:jc w:val="both"/>
-        <w:rPr>
-          <w:color w:val="000000" w:themeColor="text1"/>
-          <w:highlight w:val="cyan"/>
-          <w:lang w:val="en-US" w:eastAsia="zh-CN"/>
-        </w:rPr>
-      </w:pPr>
-      <w:r>
-        <w:rPr>
+        <w:jc w:val="center"/>
+        <w:rPr>
+          <w:rFonts w:hint="eastAsia"/>
           <w:b/>
           <w:bCs/>
           <w:color w:val="000000" w:themeColor="text1"/>
-          <w:highlight w:val="cyan"/>
           <w:lang w:val="en-US" w:eastAsia="zh-CN"/>
         </w:rPr>
+      </w:pPr>
+      <w:r>
+        <w:rPr>
+          <w:rFonts w:hint="eastAsia"/>
+          <w:b/>
+          <w:bCs/>
+          <w:noProof/>
+          <w:color w:val="000000" w:themeColor="text1"/>
+          <w:lang w:val="en-US" w:eastAsia="zh-CN"/>
+        </w:rPr>
+        <w:lastRenderedPageBreak/>
+        <w:drawing>
+          <wp:inline distT="0" distB="0" distL="0" distR="0" wp14:anchorId="776207D7" wp14:editId="2B7147FD">
+            <wp:extent cx="3500755" cy="8863330"/>
+            <wp:effectExtent l="0" t="0" r="4445" b="0"/>
+            <wp:docPr id="2054512836" name="图片 10"/>
+            <wp:cNvGraphicFramePr>
+              <a:graphicFrameLocks xmlns:a="http://schemas.openxmlformats.org/drawingml/2006/main" noChangeAspect="1"/>
+            </wp:cNvGraphicFramePr>
+            <a:graphic xmlns:a="http://schemas.openxmlformats.org/drawingml/2006/main">
+              <a:graphicData uri="http://schemas.openxmlformats.org/drawingml/2006/picture">
+                <pic:pic xmlns:pic="http://schemas.openxmlformats.org/drawingml/2006/picture">
+                  <pic:nvPicPr>
+                    <pic:cNvPr id="2054512836" name="图片 2054512836"/>
+                    <pic:cNvPicPr/>
+                  </pic:nvPicPr>
+                  <pic:blipFill>
+                    <a:blip r:embed="rId12">
+                      <a:extLst>
+                        <a:ext uri="{28A0092B-C50C-407E-A947-70E740481C1C}">
+                          <a14:useLocalDpi xmlns:a14="http://schemas.microsoft.com/office/drawing/2010/main" val="0"/>
+                        </a:ext>
+                      </a:extLst>
+                    </a:blip>
+                    <a:stretch>
+                      <a:fillRect/>
+                    </a:stretch>
+                  </pic:blipFill>
+                  <pic:spPr>
+                    <a:xfrm>
+                      <a:off x="0" y="0"/>
+                      <a:ext cx="3500755" cy="8863330"/>
+                    </a:xfrm>
+                    <a:prstGeom prst="rect">
+                      <a:avLst/>
+                    </a:prstGeom>
+                  </pic:spPr>
+                </pic:pic>
+              </a:graphicData>
+            </a:graphic>
+          </wp:inline>
+        </w:drawing>
+      </w:r>
+    </w:p>
+    <w:p>
+      <w:pPr>
+        <w:spacing w:line="259" w:lineRule="auto"/>
+        <w:jc w:val="both"/>
+        <w:rPr>
+          <w:b/>
+          <w:bCs/>
+          <w:color w:val="000000" w:themeColor="text1"/>
+          <w:lang w:val="en-US" w:eastAsia="zh-CN"/>
+        </w:rPr>
+      </w:pPr>
+    </w:p>
+    <w:p>
+      <w:pPr>
+        <w:spacing w:line="259" w:lineRule="auto"/>
+        <w:jc w:val="both"/>
+        <w:rPr>
+          <w:color w:val="000000" w:themeColor="text1"/>
+          <w:lang w:val="en-US" w:eastAsia="zh-CN"/>
+        </w:rPr>
+      </w:pPr>
+      <w:r>
+        <w:rPr>
+          <w:b/>
+          <w:bCs/>
+          <w:color w:val="000000" w:themeColor="text1"/>
+          <w:lang w:val="en-US" w:eastAsia="zh-CN"/>
+        </w:rPr>
+        <w:t>Challenges:</w:t>
+      </w:r>
+      <w:r>
+        <w:rPr>
+          <w:color w:val="000000" w:themeColor="text1"/>
+          <w:lang w:val="en-US" w:eastAsia="zh-CN"/>
+        </w:rPr>
+        <w:br/>
+        <w:t>The most significant challenge in this project was Task 2. Initially, using the </w:t>
+      </w:r>
+      <w:proofErr w:type="gramStart"/>
+      <w:r>
+        <w:rPr>
+          <w:color w:val="000000" w:themeColor="text1"/>
+          <w:lang w:val="en-US" w:eastAsia="zh-CN"/>
+        </w:rPr>
+        <w:t>pause(</w:t>
+      </w:r>
+      <w:proofErr w:type="gramEnd"/>
+      <w:r>
+        <w:rPr>
+          <w:color w:val="000000" w:themeColor="text1"/>
+          <w:lang w:val="en-US" w:eastAsia="zh-CN"/>
+        </w:rPr>
+        <w:t>) command to control the LED blinking sequence caused the entire program to halt, delaying the temperature sampling interval and freezing the live graph. Another challenge emerged in Task 3, where raw temperature differentials between consecutive seconds were too erratic due to analog sensor noise, causing the LEDs to trigger incorrectly.</w:t>
+      </w:r>
+    </w:p>
+    <w:p>
+      <w:pPr>
+        <w:spacing w:line="259" w:lineRule="auto"/>
+        <w:jc w:val="both"/>
+        <w:rPr>
+          <w:color w:val="000000" w:themeColor="text1"/>
+          <w:lang w:val="en-US" w:eastAsia="zh-CN"/>
+        </w:rPr>
+      </w:pPr>
+      <w:r>
+        <w:rPr>
+          <w:b/>
+          <w:bCs/>
+          <w:color w:val="000000" w:themeColor="text1"/>
+          <w:lang w:val="en-US" w:eastAsia="zh-CN"/>
+        </w:rPr>
         <w:t>Strengths:</w:t>
       </w:r>
       <w:r>
         <w:rPr>
           <w:color w:val="000000" w:themeColor="text1"/>
-          <w:highlight w:val="cyan"/>
           <w:lang w:val="en-US" w:eastAsia="zh-CN"/>
         </w:rPr>
         <w:br/>
@@ -427,7 +623,6 @@
         <w:jc w:val="both"/>
         <w:rPr>
           <w:color w:val="000000" w:themeColor="text1"/>
-          <w:highlight w:val="cyan"/>
           <w:lang w:val="en-US" w:eastAsia="zh-CN"/>
         </w:rPr>
       </w:pPr>
@@ -436,7 +631,6 @@
           <w:b/>
           <w:bCs/>
           <w:color w:val="000000" w:themeColor="text1"/>
-          <w:highlight w:val="cyan"/>
           <w:lang w:val="en-US" w:eastAsia="zh-CN"/>
         </w:rPr>
         <w:t>Limitations:</w:t>
@@ -444,7 +638,6 @@
       <w:r>
         <w:rPr>
           <w:color w:val="000000" w:themeColor="text1"/>
-          <w:highlight w:val="cyan"/>
           <w:lang w:val="en-US" w:eastAsia="zh-CN"/>
         </w:rPr>
         <w:br/>
@@ -457,7 +650,6 @@
         <w:jc w:val="both"/>
         <w:rPr>
           <w:color w:val="000000" w:themeColor="text1"/>
-          <w:highlight w:val="cyan"/>
           <w:lang w:val="en-US" w:eastAsia="zh-CN"/>
         </w:rPr>
       </w:pPr>
@@ -466,15 +658,32 @@
           <w:b/>
           <w:bCs/>
           <w:color w:val="000000" w:themeColor="text1"/>
-          <w:highlight w:val="cyan"/>
           <w:lang w:val="en-US" w:eastAsia="zh-CN"/>
         </w:rPr>
-        <w:t>Suggested Future Improvements:</w:t>
-      </w:r>
-      <w:r>
-        <w:rPr>
-          <w:color w:val="000000" w:themeColor="text1"/>
-          <w:highlight w:val="cyan"/>
+        <w:t>Suggested</w:t>
+      </w:r>
+      <w:r>
+        <w:rPr>
+          <w:rFonts w:hint="eastAsia"/>
+          <w:b/>
+          <w:bCs/>
+          <w:color w:val="000000" w:themeColor="text1"/>
+          <w:lang w:val="en-US" w:eastAsia="zh-CN"/>
+        </w:rPr>
+        <w:t xml:space="preserve"> </w:t>
+      </w:r>
+      <w:r>
+        <w:rPr>
+          <w:b/>
+          <w:bCs/>
+          <w:color w:val="000000" w:themeColor="text1"/>
+          <w:lang w:val="en-US" w:eastAsia="zh-CN"/>
+        </w:rPr>
+        <w:t>Future Improvements:</w:t>
+      </w:r>
+      <w:r>
+        <w:rPr>
+          <w:color w:val="000000" w:themeColor="text1"/>
           <w:lang w:val="en-US" w:eastAsia="zh-CN"/>
         </w:rPr>
         <w:br/>
@@ -487,20 +696,9 @@
         <w:jc w:val="both"/>
         <w:rPr>
           <w:color w:val="000000" w:themeColor="text1"/>
-          <w:highlight w:val="cyan"/>
           <w:lang w:val="en-US" w:eastAsia="zh-CN"/>
         </w:rPr>
       </w:pPr>
-      <w:r>
-        <w:rPr>
-          <w:color w:val="000000" w:themeColor="text1"/>
-          <w:highlight w:val="cyan"/>
-          <w:lang w:val="en-US" w:eastAsia="zh-CN"/>
-        </w:rPr>
-        <w:pict w14:anchorId="6A05A942">
-          <v:rect id="_x0000_i1033" style="width:730.65pt;height:1.5pt" o:hrpct="0" o:hralign="center" o:hrstd="t" o:hr="t" fillcolor="#a0a0a0" stroked="f"/>
-        </w:pict>
-      </w:r>
     </w:p>
     <w:p>
       <w:pPr>
@@ -509,16 +707,17 @@
         <w:rPr>
           <w:rFonts w:hint="eastAsia"/>
           <w:color w:val="000000" w:themeColor="text1"/>
-          <w:highlight w:val="cyan"/>
           <w:lang w:eastAsia="zh-CN"/>
         </w:rPr>
       </w:pPr>
     </w:p>
     <w:sectPr>
-      <w:headerReference w:type="default" r:id="rId10"/>
-      <w:footerReference w:type="default" r:id="rId11"/>
-      <w:headerReference w:type="first" r:id="rId12"/>
-      <w:footerReference w:type="first" r:id="rId13"/>
+      <w:headerReference w:type="even" r:id="rId13"/>
+      <w:headerReference w:type="default" r:id="rId14"/>
+      <w:footerReference w:type="even" r:id="rId15"/>
+      <w:footerReference w:type="default" r:id="rId16"/>
+      <w:headerReference w:type="first" r:id="rId17"/>
+      <w:footerReference w:type="first" r:id="rId18"/>
       <w:pgSz w:w="11906" w:h="16838"/>
       <w:pgMar w:top="1440" w:right="1440" w:bottom="1440" w:left="1440" w:header="850" w:footer="708" w:gutter="0"/>
       <w:cols w:space="708"/>
@@ -556,6 +755,16 @@
 </file>
 
 <file path=word/footer1.xml><?xml version="1.0" encoding="utf-8"?>
+<w:ftr xmlns:wpc="http://schemas.microsoft.com/office/word/2010/wordprocessingCanvas" xmlns:cx="http://schemas.microsoft.com/office/drawing/2014/chartex" xmlns:cx1="http://schemas.microsoft.com/office/drawing/2015/9/8/chartex" xmlns:cx2="http://schemas.microsoft.com/office/drawing/2015/10/21/chartex" xmlns:cx3="http://schemas.microsoft.com/office/drawing/2016/5/9/chartex" xmlns:cx4="http://schemas.microsoft.com/office/drawing/2016/5/10/chartex" xmlns:cx5="http://schemas.microsoft.com/office/drawing/2016/5/11/chartex" xmlns:cx6="http://schemas.microsoft.com/office/drawing/2016/5/12/chartex" xmlns:cx7="http://schemas.microsoft.com/office/drawing/2016/5/13/chartex" xmlns:cx8="http://schemas.microsoft.com/office/drawing/2016/5/14/chartex" xmlns:mc="http://schemas.openxmlformats.org/markup-compatibility/2006" xmlns:aink="http://schemas.microsoft.com/office/drawing/2016/ink" xmlns:am3d="http://schemas.microsoft.com/office/drawing/2017/model3d" xmlns:o="urn:schemas-microsoft-com:office:office" xmlns:oel="http://schemas.microsoft.com/office/2019/extlst" xmlns:r="http://schemas.openxmlformats.org/officeDocument/2006/relationships" xmlns:m="http://schemas.openxmlformats.org/officeDocument/2006/math" xmlns:v="urn:schemas-microsoft-com:vml" xmlns:wp14="http://schemas.microsoft.com/office/word/2010/wordprocessingDrawing" xmlns:wp="http://schemas.openxmlformats.org/drawingml/2006/wordprocessingDrawing" xmlns:w10="urn:schemas-microsoft-com:office:word" xmlns:w="http://schemas.openxmlformats.org/wordprocessingml/2006/main" xmlns:w14="http://schemas.microsoft.com/office/word/2010/wordml" xmlns:w15="http://schemas.microsoft.com/office/word/2012/wordml" xmlns:w16cex="http://schemas.microsoft.com/office/word/2018/wordml/cex" xmlns:w16cid="http://schemas.microsoft.com/office/word/2016/wordml/cid" xmlns:w16="http://schemas.microsoft.com/office/word/2018/wordml" xmlns:w16du="http://schemas.microsoft.com/office/word/2023/wordml/word16du" xmlns:w16sdtdh="http://schemas.microsoft.com/office/word/2020/wordml/sdtdatahash" xmlns:w16sdtfl="http://schemas.microsoft.com/office/word/2024/wordml/sdtformatlock" xmlns:w16se="http://schemas.microsoft.com/office/word/2015/wordml/symex" xmlns:wpg="http://schemas.microsoft.com/office/word/2010/wordprocessingGroup" xmlns:wpi="http://schemas.microsoft.com/office/word/2010/wordprocessingInk" xmlns:wne="http://schemas.microsoft.com/office/word/2006/wordml" xmlns:wps="http://schemas.microsoft.com/office/word/2010/wordprocessingShape" mc:Ignorable="w14 w15 w16se w16cid w16 w16cex w16sdtdh w16sdtfl w16du wp14">
+  <w:p>
+    <w:pPr>
+      <w:pStyle w:val="a6"/>
+    </w:pPr>
+  </w:p>
+</w:ftr>
+</file>
+
+<file path=word/footer2.xml><?xml version="1.0" encoding="utf-8"?>
 <w:ftr xmlns:wpc="http://schemas.microsoft.com/office/word/2010/wordprocessingCanvas" xmlns:cx="http://schemas.microsoft.com/office/drawing/2014/chartex" xmlns:cx1="http://schemas.microsoft.com/office/drawing/2015/9/8/chartex" xmlns:cx2="http://schemas.microsoft.com/office/drawing/2015/10/21/chartex" xmlns:cx3="http://schemas.microsoft.com/office/drawing/2016/5/9/chartex" xmlns:cx4="http://schemas.microsoft.com/office/drawing/2016/5/10/chartex" xmlns:cx5="http://schemas.microsoft.com/office/drawing/2016/5/11/chartex" xmlns:cx6="http://schemas.microsoft.com/office/drawing/2016/5/12/chartex" xmlns:cx7="http://schemas.microsoft.com/office/drawing/2016/5/13/chartex" xmlns:cx8="http://schemas.microsoft.com/office/drawing/2016/5/14/chartex" xmlns:mc="http://schemas.openxmlformats.org/markup-compatibility/2006" xmlns:aink="http://schemas.microsoft.com/office/drawing/2016/ink" xmlns:am3d="http://schemas.microsoft.com/office/drawing/2017/model3d" xmlns:o="urn:schemas-microsoft-com:office:office" xmlns:oel="http://schemas.microsoft.com/office/2019/extlst" xmlns:r="http://schemas.openxmlformats.org/officeDocument/2006/relationships" xmlns:m="http://schemas.openxmlformats.org/officeDocument/2006/math" xmlns:v="urn:schemas-microsoft-com:vml" xmlns:wp14="http://schemas.microsoft.com/office/word/2010/wordprocessingDrawing" xmlns:wp="http://schemas.openxmlformats.org/drawingml/2006/wordprocessingDrawing" xmlns:w10="urn:schemas-microsoft-com:office:word" xmlns:w="http://schemas.openxmlformats.org/wordprocessingml/2006/main" xmlns:w14="http://schemas.microsoft.com/office/word/2010/wordml" xmlns:w15="http://schemas.microsoft.com/office/word/2012/wordml" xmlns:w16cex="http://schemas.microsoft.com/office/word/2018/wordml/cex" xmlns:w16cid="http://schemas.microsoft.com/office/word/2016/wordml/cid" xmlns:w16="http://schemas.microsoft.com/office/word/2018/wordml" xmlns:w16du="http://schemas.microsoft.com/office/word/2023/wordml/word16du" xmlns:w16sdtdh="http://schemas.microsoft.com/office/word/2020/wordml/sdtdatahash" xmlns:w16sdtfl="http://schemas.microsoft.com/office/word/2024/wordml/sdtformatlock" xmlns:w16se="http://schemas.microsoft.com/office/word/2015/wordml/symex" xmlns:wpg="http://schemas.microsoft.com/office/word/2010/wordprocessingGroup" xmlns:wpi="http://schemas.microsoft.com/office/word/2010/wordprocessingInk" xmlns:wne="http://schemas.microsoft.com/office/word/2006/wordml" xmlns:wps="http://schemas.microsoft.com/office/word/2010/wordprocessingShape" mc:Ignorable="w14 w15 w16se w16cid w16 w16cex w16sdtdh w16sdtfl w16du wp14">
   <w:sdt>
     <w:sdtPr>
@@ -632,7 +841,7 @@
             </mc:Choice>
             <mc:Fallback>
               <w:pict>
-                <v:line w14:anchorId="58087435" id="Straight Connector 4" o:spid="_x0000_s1026" style="position:absolute;z-index:251658243;visibility:visible;mso-wrap-style:square;mso-wrap-distance-left:9pt;mso-wrap-distance-top:0;mso-wrap-distance-right:9pt;mso-wrap-distance-bottom:0;mso-position-horizontal:absolute;mso-position-horizontal-relative:text;mso-position-vertical:absolute;mso-position-vertical-relative:text" from="-.75pt,-10.2pt" to="454.5pt,-10.2pt" o:gfxdata="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" strokecolor="#4472c4 [3204]" strokeweight=".5pt">
+                <v:line w14:anchorId="20FBC31D" id="Straight Connector 4" o:spid="_x0000_s1026" style="position:absolute;z-index:251658243;visibility:visible;mso-wrap-style:square;mso-wrap-distance-left:9pt;mso-wrap-distance-top:0;mso-wrap-distance-right:9pt;mso-wrap-distance-bottom:0;mso-position-horizontal:absolute;mso-position-horizontal-relative:text;mso-position-vertical:absolute;mso-position-vertical-relative:text" from="-.75pt,-10.2pt" to="454.5pt,-10.2pt" o:gfxdata="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" strokecolor="#4472c4 [3204]" strokeweight=".5pt">
                   <v:stroke joinstyle="miter"/>
                 </v:line>
               </w:pict>
@@ -667,31 +876,37 @@
     <w:pPr>
       <w:pStyle w:val="a6"/>
       <w:rPr>
+        <w:rFonts w:hint="eastAsia"/>
         <w:i/>
         <w:iCs/>
         <w:sz w:val="18"/>
         <w:szCs w:val="18"/>
+        <w:lang w:eastAsia="zh-CN"/>
       </w:rPr>
     </w:pPr>
+    <w:proofErr w:type="spellStart"/>
     <w:r>
       <w:rPr>
+        <w:rFonts w:hint="eastAsia"/>
         <w:i/>
         <w:iCs/>
         <w:sz w:val="18"/>
         <w:szCs w:val="18"/>
-        <w:highlight w:val="yellow"/>
-      </w:rPr>
-      <w:t>Your name</w:t>
+        <w:lang w:eastAsia="zh-CN"/>
+      </w:rPr>
+      <w:t>Jiekai</w:t>
     </w:r>
+    <w:proofErr w:type="spellEnd"/>
     <w:r>
       <w:rPr>
+        <w:rFonts w:hint="eastAsia"/>
         <w:i/>
         <w:iCs/>
         <w:sz w:val="18"/>
         <w:szCs w:val="18"/>
-        <w:highlight w:val="yellow"/>
-      </w:rPr>
-      <w:t>, student ID</w:t>
+        <w:lang w:eastAsia="zh-CN"/>
+      </w:rPr>
+      <w:t xml:space="preserve"> Song</w:t>
     </w:r>
     <w:r>
       <w:rPr>
@@ -700,13 +915,24 @@
         <w:sz w:val="18"/>
         <w:szCs w:val="18"/>
       </w:rPr>
-      <w:t xml:space="preserve"> </w:t>
+      <w:t>,</w:t>
+    </w:r>
+    <w:r>
+      <w:rPr>
+        <w:rFonts w:hint="eastAsia"/>
+        <w:i/>
+        <w:iCs/>
+        <w:sz w:val="18"/>
+        <w:szCs w:val="18"/>
+        <w:lang w:eastAsia="zh-CN"/>
+      </w:rPr>
+      <w:t xml:space="preserve"> 20717659</w:t>
     </w:r>
   </w:p>
 </w:ftr>
 </file>
 
-<file path=word/footer2.xml><?xml version="1.0" encoding="utf-8"?>
+<file path=word/footer3.xml><?xml version="1.0" encoding="utf-8"?>
 <w:ftr xmlns:wpc="http://schemas.microsoft.com/office/word/2010/wordprocessingCanvas" xmlns:cx="http://schemas.microsoft.com/office/drawing/2014/chartex" xmlns:cx1="http://schemas.microsoft.com/office/drawing/2015/9/8/chartex" xmlns:cx2="http://schemas.microsoft.com/office/drawing/2015/10/21/chartex" xmlns:cx3="http://schemas.microsoft.com/office/drawing/2016/5/9/chartex" xmlns:cx4="http://schemas.microsoft.com/office/drawing/2016/5/10/chartex" xmlns:cx5="http://schemas.microsoft.com/office/drawing/2016/5/11/chartex" xmlns:cx6="http://schemas.microsoft.com/office/drawing/2016/5/12/chartex" xmlns:cx7="http://schemas.microsoft.com/office/drawing/2016/5/13/chartex" xmlns:cx8="http://schemas.microsoft.com/office/drawing/2016/5/14/chartex" xmlns:mc="http://schemas.openxmlformats.org/markup-compatibility/2006" xmlns:aink="http://schemas.microsoft.com/office/drawing/2016/ink" xmlns:am3d="http://schemas.microsoft.com/office/drawing/2017/model3d" xmlns:o="urn:schemas-microsoft-com:office:office" xmlns:oel="http://schemas.microsoft.com/office/2019/extlst" xmlns:r="http://schemas.openxmlformats.org/officeDocument/2006/relationships" xmlns:m="http://schemas.openxmlformats.org/officeDocument/2006/math" xmlns:v="urn:schemas-microsoft-com:vml" xmlns:wp14="http://schemas.microsoft.com/office/word/2010/wordprocessingDrawing" xmlns:wp="http://schemas.openxmlformats.org/drawingml/2006/wordprocessingDrawing" xmlns:w10="urn:schemas-microsoft-com:office:word" xmlns:w="http://schemas.openxmlformats.org/wordprocessingml/2006/main" xmlns:w14="http://schemas.microsoft.com/office/word/2010/wordml" xmlns:w15="http://schemas.microsoft.com/office/word/2012/wordml" xmlns:w16cex="http://schemas.microsoft.com/office/word/2018/wordml/cex" xmlns:w16cid="http://schemas.microsoft.com/office/word/2016/wordml/cid" xmlns:w16="http://schemas.microsoft.com/office/word/2018/wordml" xmlns:w16du="http://schemas.microsoft.com/office/word/2023/wordml/word16du" xmlns:w16sdtdh="http://schemas.microsoft.com/office/word/2020/wordml/sdtdatahash" xmlns:w16sdtfl="http://schemas.microsoft.com/office/word/2024/wordml/sdtformatlock" xmlns:w16se="http://schemas.microsoft.com/office/word/2015/wordml/symex" xmlns:wpg="http://schemas.microsoft.com/office/word/2010/wordprocessingGroup" xmlns:wpi="http://schemas.microsoft.com/office/word/2010/wordprocessingInk" xmlns:wne="http://schemas.microsoft.com/office/word/2006/wordml" xmlns:wps="http://schemas.microsoft.com/office/word/2010/wordprocessingShape" mc:Ignorable="w14 w15 w16se w16cid w16 w16cex w16sdtdh w16sdtfl w16du wp14">
   <w:p>
     <w:pPr>
@@ -753,6 +979,16 @@
   <w:p>
     <w:pPr>
       <w:pStyle w:val="a4"/>
+    </w:pPr>
+  </w:p>
+</w:hdr>
+</file>
+
+<file path=word/header2.xml><?xml version="1.0" encoding="utf-8"?>
+<w:hdr xmlns:wpc="http://schemas.microsoft.com/office/word/2010/wordprocessingCanvas" xmlns:cx="http://schemas.microsoft.com/office/drawing/2014/chartex" xmlns:cx1="http://schemas.microsoft.com/office/drawing/2015/9/8/chartex" xmlns:cx2="http://schemas.microsoft.com/office/drawing/2015/10/21/chartex" xmlns:cx3="http://schemas.microsoft.com/office/drawing/2016/5/9/chartex" xmlns:cx4="http://schemas.microsoft.com/office/drawing/2016/5/10/chartex" xmlns:cx5="http://schemas.microsoft.com/office/drawing/2016/5/11/chartex" xmlns:cx6="http://schemas.microsoft.com/office/drawing/2016/5/12/chartex" xmlns:cx7="http://schemas.microsoft.com/office/drawing/2016/5/13/chartex" xmlns:cx8="http://schemas.microsoft.com/office/drawing/2016/5/14/chartex" xmlns:mc="http://schemas.openxmlformats.org/markup-compatibility/2006" xmlns:aink="http://schemas.microsoft.com/office/drawing/2016/ink" xmlns:am3d="http://schemas.microsoft.com/office/drawing/2017/model3d" xmlns:o="urn:schemas-microsoft-com:office:office" xmlns:oel="http://schemas.microsoft.com/office/2019/extlst" xmlns:r="http://schemas.openxmlformats.org/officeDocument/2006/relationships" xmlns:m="http://schemas.openxmlformats.org/officeDocument/2006/math" xmlns:v="urn:schemas-microsoft-com:vml" xmlns:wp14="http://schemas.microsoft.com/office/word/2010/wordprocessingDrawing" xmlns:wp="http://schemas.openxmlformats.org/drawingml/2006/wordprocessingDrawing" xmlns:w10="urn:schemas-microsoft-com:office:word" xmlns:w="http://schemas.openxmlformats.org/wordprocessingml/2006/main" xmlns:w14="http://schemas.microsoft.com/office/word/2010/wordml" xmlns:w15="http://schemas.microsoft.com/office/word/2012/wordml" xmlns:w16cex="http://schemas.microsoft.com/office/word/2018/wordml/cex" xmlns:w16cid="http://schemas.microsoft.com/office/word/2016/wordml/cid" xmlns:w16="http://schemas.microsoft.com/office/word/2018/wordml" xmlns:w16du="http://schemas.microsoft.com/office/word/2023/wordml/word16du" xmlns:w16sdtdh="http://schemas.microsoft.com/office/word/2020/wordml/sdtdatahash" xmlns:w16sdtfl="http://schemas.microsoft.com/office/word/2024/wordml/sdtformatlock" xmlns:w16se="http://schemas.microsoft.com/office/word/2015/wordml/symex" xmlns:wpg="http://schemas.microsoft.com/office/word/2010/wordprocessingGroup" xmlns:wpi="http://schemas.microsoft.com/office/word/2010/wordprocessingInk" xmlns:wne="http://schemas.microsoft.com/office/word/2006/wordml" xmlns:wps="http://schemas.microsoft.com/office/word/2010/wordprocessingShape" mc:Ignorable="w14 w15 w16se w16cid w16 w16cex w16sdtdh w16sdtfl w16du wp14">
+  <w:p>
+    <w:pPr>
+      <w:pStyle w:val="a4"/>
       <w:rPr>
         <w:i/>
         <w:iCs/>
@@ -775,7 +1011,7 @@
 </w:hdr>
 </file>
 
-<file path=word/header2.xml><?xml version="1.0" encoding="utf-8"?>
+<file path=word/header3.xml><?xml version="1.0" encoding="utf-8"?>
 <w:hdr xmlns:wpc="http://schemas.microsoft.com/office/word/2010/wordprocessingCanvas" xmlns:cx="http://schemas.microsoft.com/office/drawing/2014/chartex" xmlns:cx1="http://schemas.microsoft.com/office/drawing/2015/9/8/chartex" xmlns:cx2="http://schemas.microsoft.com/office/drawing/2015/10/21/chartex" xmlns:cx3="http://schemas.microsoft.com/office/drawing/2016/5/9/chartex" xmlns:cx4="http://schemas.microsoft.com/office/drawing/2016/5/10/chartex" xmlns:cx5="http://schemas.microsoft.com/office/drawing/2016/5/11/chartex" xmlns:cx6="http://schemas.microsoft.com/office/drawing/2016/5/12/chartex" xmlns:cx7="http://schemas.microsoft.com/office/drawing/2016/5/13/chartex" xmlns:cx8="http://schemas.microsoft.com/office/drawing/2016/5/14/chartex" xmlns:mc="http://schemas.openxmlformats.org/markup-compatibility/2006" xmlns:aink="http://schemas.microsoft.com/office/drawing/2016/ink" xmlns:am3d="http://schemas.microsoft.com/office/drawing/2017/model3d" xmlns:o="urn:schemas-microsoft-com:office:office" xmlns:oel="http://schemas.microsoft.com/office/2019/extlst" xmlns:r="http://schemas.openxmlformats.org/officeDocument/2006/relationships" xmlns:m="http://schemas.openxmlformats.org/officeDocument/2006/math" xmlns:v="urn:schemas-microsoft-com:vml" xmlns:wp14="http://schemas.microsoft.com/office/word/2010/wordprocessingDrawing" xmlns:wp="http://schemas.openxmlformats.org/drawingml/2006/wordprocessingDrawing" xmlns:w10="urn:schemas-microsoft-com:office:word" xmlns:w="http://schemas.openxmlformats.org/wordprocessingml/2006/main" xmlns:w14="http://schemas.microsoft.com/office/word/2010/wordml" xmlns:w15="http://schemas.microsoft.com/office/word/2012/wordml" xmlns:w16cex="http://schemas.microsoft.com/office/word/2018/wordml/cex" xmlns:w16cid="http://schemas.microsoft.com/office/word/2016/wordml/cid" xmlns:w16="http://schemas.microsoft.com/office/word/2018/wordml" xmlns:w16du="http://schemas.microsoft.com/office/word/2023/wordml/word16du" xmlns:w16sdtdh="http://schemas.microsoft.com/office/word/2020/wordml/sdtdatahash" xmlns:w16sdtfl="http://schemas.microsoft.com/office/word/2024/wordml/sdtformatlock" xmlns:w16se="http://schemas.microsoft.com/office/word/2015/wordml/symex" xmlns:wpg="http://schemas.microsoft.com/office/word/2010/wordprocessingGroup" xmlns:wpi="http://schemas.microsoft.com/office/word/2010/wordprocessingInk" xmlns:wne="http://schemas.microsoft.com/office/word/2006/wordml" xmlns:wps="http://schemas.microsoft.com/office/word/2010/wordprocessingShape" mc:Ignorable="w14 w15 w16se w16cid w16 w16cex w16sdtdh w16sdtfl w16du wp14">
   <w:p>
     <w:pPr>

</xml_diff>

<commit_message>
finish writing reflective statement; fine tuning annotations
</commit_message>
<xml_diff>
--- a/CW2/MATLAB Coursework 2  Word Template.docx
+++ b/CW2/MATLAB Coursework 2  Word Template.docx
@@ -2,19 +2,17 @@
 <file path=word/document.xml><?xml version="1.0" encoding="utf-8"?>
 <w:document xmlns:wpc="http://schemas.microsoft.com/office/word/2010/wordprocessingCanvas" xmlns:cx="http://schemas.microsoft.com/office/drawing/2014/chartex" xmlns:cx1="http://schemas.microsoft.com/office/drawing/2015/9/8/chartex" xmlns:cx2="http://schemas.microsoft.com/office/drawing/2015/10/21/chartex" xmlns:cx3="http://schemas.microsoft.com/office/drawing/2016/5/9/chartex" xmlns:cx4="http://schemas.microsoft.com/office/drawing/2016/5/10/chartex" xmlns:cx5="http://schemas.microsoft.com/office/drawing/2016/5/11/chartex" xmlns:cx6="http://schemas.microsoft.com/office/drawing/2016/5/12/chartex" xmlns:cx7="http://schemas.microsoft.com/office/drawing/2016/5/13/chartex" xmlns:cx8="http://schemas.microsoft.com/office/drawing/2016/5/14/chartex" xmlns:mc="http://schemas.openxmlformats.org/markup-compatibility/2006" xmlns:aink="http://schemas.microsoft.com/office/drawing/2016/ink" xmlns:am3d="http://schemas.microsoft.com/office/drawing/2017/model3d" xmlns:o="urn:schemas-microsoft-com:office:office" xmlns:oel="http://schemas.microsoft.com/office/2019/extlst" xmlns:r="http://schemas.openxmlformats.org/officeDocument/2006/relationships" xmlns:m="http://schemas.openxmlformats.org/officeDocument/2006/math" xmlns:v="urn:schemas-microsoft-com:vml" xmlns:wp14="http://schemas.microsoft.com/office/word/2010/wordprocessingDrawing" xmlns:wp="http://schemas.openxmlformats.org/drawingml/2006/wordprocessingDrawing" xmlns:w10="urn:schemas-microsoft-com:office:word" xmlns:w="http://schemas.openxmlformats.org/wordprocessingml/2006/main" xmlns:w14="http://schemas.microsoft.com/office/word/2010/wordml" xmlns:w15="http://schemas.microsoft.com/office/word/2012/wordml" xmlns:w16cex="http://schemas.microsoft.com/office/word/2018/wordml/cex" xmlns:w16cid="http://schemas.microsoft.com/office/word/2016/wordml/cid" xmlns:w16="http://schemas.microsoft.com/office/word/2018/wordml" xmlns:w16du="http://schemas.microsoft.com/office/word/2023/wordml/word16du" xmlns:w16sdtdh="http://schemas.microsoft.com/office/word/2020/wordml/sdtdatahash" xmlns:w16sdtfl="http://schemas.microsoft.com/office/word/2024/wordml/sdtformatlock" xmlns:w16se="http://schemas.microsoft.com/office/word/2015/wordml/symex" xmlns:wpg="http://schemas.microsoft.com/office/word/2010/wordprocessingGroup" xmlns:wpi="http://schemas.microsoft.com/office/word/2010/wordprocessingInk" xmlns:wne="http://schemas.microsoft.com/office/word/2006/wordml" xmlns:wps="http://schemas.microsoft.com/office/word/2010/wordprocessingShape" mc:Ignorable="w14 w15 w16se w16cid w16 w16cex w16sdtdh w16sdtfl w16du wp14">
   <w:body>
-    <w:p/>
-    <w:p/>
-    <w:p/>
-    <w:p/>
     <w:p>
       <w:pPr>
         <w:pStyle w:val="a8"/>
+        <w:rPr>
+          <w:rFonts w:hint="eastAsia"/>
+        </w:rPr>
       </w:pPr>
       <w:r>
         <w:t>AERO1005 MATLAB Coursework 2</w:t>
       </w:r>
     </w:p>
-    <w:p/>
     <w:p>
       <w:pPr>
         <w:rPr>
@@ -104,56 +102,22 @@
         <w:t>2026/05/03</w:t>
       </w:r>
     </w:p>
-    <w:p/>
-    <w:p/>
-    <w:p/>
-    <w:p/>
     <w:p>
       <w:pPr>
         <w:rPr>
+          <w:rFonts w:hint="eastAsia"/>
           <w:highlight w:val="cyan"/>
         </w:rPr>
       </w:pPr>
       <w:r>
         <w:rPr>
-          <w:highlight w:val="cyan"/>
-        </w:rPr>
-        <w:br w:type="page"/>
-      </w:r>
-    </w:p>
-    <w:p>
-      <w:pPr>
-        <w:rPr>
-          <w:color w:val="808080" w:themeColor="background1" w:themeShade="80"/>
-        </w:rPr>
-      </w:pPr>
-      <w:r>
-        <w:rPr>
-          <w:color w:val="808080" w:themeColor="background1" w:themeShade="80"/>
-        </w:rPr>
-        <w:lastRenderedPageBreak/>
-        <w:t>For questions which require you to write text (i.e., descriptive sentences), or include images and graphs, please add them to the Word submission template.</w:t>
-      </w:r>
-    </w:p>
-    <w:p>
-      <w:pPr>
+          <w:lang w:eastAsia="zh-CN"/>
+        </w:rPr>
+        <w:t>T</w:t>
+      </w:r>
+      <w:r>
         <w:rPr>
           <w:rFonts w:hint="eastAsia"/>
-          <w:color w:val="808080" w:themeColor="background1" w:themeShade="80"/>
-          <w:lang w:eastAsia="zh-CN"/>
-        </w:rPr>
-      </w:pPr>
-      <w:r>
-        <w:rPr>
-          <w:color w:val="808080" w:themeColor="background1" w:themeShade="80"/>
-          <w:lang w:eastAsia="zh-CN"/>
-        </w:rPr>
-        <w:t>T</w:t>
-      </w:r>
-      <w:r>
-        <w:rPr>
-          <w:rFonts w:hint="eastAsia"/>
-          <w:color w:val="808080" w:themeColor="background1" w:themeShade="80"/>
           <w:lang w:eastAsia="zh-CN"/>
         </w:rPr>
         <w:t>ask1</w:t>
@@ -266,10 +230,10 @@
           <w:lang w:eastAsia="zh-CN"/>
         </w:rPr>
         <w:drawing>
-          <wp:inline distT="0" distB="0" distL="0" distR="0" wp14:anchorId="1DBDCA4D" wp14:editId="26113C94">
-            <wp:extent cx="3180205" cy="4241800"/>
-            <wp:effectExtent l="0" t="0" r="1270" b="6350"/>
-            <wp:docPr id="1679888415" name="图片 5"/>
+          <wp:inline distT="0" distB="0" distL="0" distR="0" wp14:anchorId="2A6B5CE6" wp14:editId="4FB32FA3">
+            <wp:extent cx="3307576" cy="3108960"/>
+            <wp:effectExtent l="0" t="0" r="7620" b="0"/>
+            <wp:docPr id="506415544" name="图片 12"/>
             <wp:cNvGraphicFramePr>
               <a:graphicFrameLocks xmlns:a="http://schemas.openxmlformats.org/drawingml/2006/main" noChangeAspect="1"/>
             </wp:cNvGraphicFramePr>
@@ -277,7 +241,7 @@
               <a:graphicData uri="http://schemas.openxmlformats.org/drawingml/2006/picture">
                 <pic:pic xmlns:pic="http://schemas.openxmlformats.org/drawingml/2006/picture">
                   <pic:nvPicPr>
-                    <pic:cNvPr id="0" name="Picture 12"/>
+                    <pic:cNvPr id="0" name="Picture 17"/>
                     <pic:cNvPicPr>
                       <a:picLocks noChangeAspect="1" noChangeArrowheads="1"/>
                     </pic:cNvPicPr>
@@ -298,7 +262,7 @@
                   <pic:spPr bwMode="auto">
                     <a:xfrm>
                       <a:off x="0" y="0"/>
-                      <a:ext cx="3183160" cy="4245742"/>
+                      <a:ext cx="3310028" cy="3111265"/>
                     </a:xfrm>
                     <a:prstGeom prst="rect">
                       <a:avLst/>
@@ -538,19 +502,65 @@
     <w:p>
       <w:pPr>
         <w:spacing w:line="259" w:lineRule="auto"/>
-        <w:jc w:val="both"/>
+        <w:rPr>
+          <w:color w:val="000000" w:themeColor="text1"/>
+          <w:lang w:val="en-US" w:eastAsia="zh-CN"/>
+        </w:rPr>
+      </w:pPr>
+      <w:r>
         <w:rPr>
           <w:b/>
           <w:bCs/>
           <w:color w:val="000000" w:themeColor="text1"/>
           <w:lang w:val="en-US" w:eastAsia="zh-CN"/>
         </w:rPr>
-      </w:pPr>
+        <w:lastRenderedPageBreak/>
+        <w:t>Challenges:</w:t>
+      </w:r>
+      <w:r>
+        <w:rPr>
+          <w:color w:val="000000" w:themeColor="text1"/>
+          <w:lang w:val="en-US" w:eastAsia="zh-CN"/>
+        </w:rPr>
+        <w:br/>
+        <w:t>The most significant challenge in this project was Task 2. Initially, using the </w:t>
+      </w:r>
+      <w:proofErr w:type="gramStart"/>
+      <w:r>
+        <w:rPr>
+          <w:color w:val="000000" w:themeColor="text1"/>
+          <w:lang w:val="en-US" w:eastAsia="zh-CN"/>
+        </w:rPr>
+        <w:t>pause(</w:t>
+      </w:r>
+      <w:proofErr w:type="gramEnd"/>
+      <w:r>
+        <w:rPr>
+          <w:color w:val="000000" w:themeColor="text1"/>
+          <w:lang w:val="en-US" w:eastAsia="zh-CN"/>
+        </w:rPr>
+        <w:t xml:space="preserve">) command to control the LED blinking sequence caused the entire program to halt, delaying the temperature sampling interval and freezing the live graph. </w:t>
+      </w:r>
     </w:p>
     <w:p>
       <w:pPr>
         <w:spacing w:line="259" w:lineRule="auto"/>
-        <w:jc w:val="both"/>
+        <w:rPr>
+          <w:color w:val="000000" w:themeColor="text1"/>
+          <w:lang w:val="en-US" w:eastAsia="zh-CN"/>
+        </w:rPr>
+      </w:pPr>
+      <w:r>
+        <w:rPr>
+          <w:color w:val="000000" w:themeColor="text1"/>
+          <w:lang w:val="en-US" w:eastAsia="zh-CN"/>
+        </w:rPr>
+        <w:t>Another challenge emerged in Task 3, where raw temperature differentials between consecutive seconds were too erratic due to analog sensor noise, causing the LEDs to trigger incorrectly.</w:t>
+      </w:r>
+    </w:p>
+    <w:p>
+      <w:pPr>
+        <w:spacing w:line="259" w:lineRule="auto"/>
         <w:rPr>
           <w:color w:val="000000" w:themeColor="text1"/>
           <w:lang w:val="en-US" w:eastAsia="zh-CN"/>
@@ -563,7 +573,7 @@
           <w:color w:val="000000" w:themeColor="text1"/>
           <w:lang w:val="en-US" w:eastAsia="zh-CN"/>
         </w:rPr>
-        <w:t>Challenges:</w:t>
+        <w:t>Strengths:</w:t>
       </w:r>
       <w:r>
         <w:rPr>
@@ -571,29 +581,103 @@
           <w:lang w:val="en-US" w:eastAsia="zh-CN"/>
         </w:rPr>
         <w:br/>
-        <w:t>The most significant challenge in this project was Task 2. Initially, using the </w:t>
-      </w:r>
-      <w:proofErr w:type="gramStart"/>
-      <w:r>
-        <w:rPr>
-          <w:color w:val="000000" w:themeColor="text1"/>
-          <w:lang w:val="en-US" w:eastAsia="zh-CN"/>
-        </w:rPr>
-        <w:t>pause(</w:t>
-      </w:r>
-      <w:proofErr w:type="gramEnd"/>
-      <w:r>
-        <w:rPr>
-          <w:color w:val="000000" w:themeColor="text1"/>
-          <w:lang w:val="en-US" w:eastAsia="zh-CN"/>
-        </w:rPr>
-        <w:t>) command to control the LED blinking sequence caused the entire program to halt, delaying the temperature sampling interval and freezing the live graph. Another challenge emerged in Task 3, where raw temperature differentials between consecutive seconds were too erratic due to analog sensor noise, causing the LEDs to trigger incorrectly.</w:t>
+        <w:t>To</w:t>
+      </w:r>
+      <w:r>
+        <w:rPr>
+          <w:rFonts w:hint="eastAsia"/>
+          <w:color w:val="000000" w:themeColor="text1"/>
+          <w:lang w:val="en-US" w:eastAsia="zh-CN"/>
+        </w:rPr>
+        <w:t xml:space="preserve"> </w:t>
+      </w:r>
+      <w:r>
+        <w:rPr>
+          <w:color w:val="000000" w:themeColor="text1"/>
+          <w:lang w:val="en-US" w:eastAsia="zh-CN"/>
+        </w:rPr>
+        <w:t>overcome the blocking issue, a non-blocking timer was developed using</w:t>
+      </w:r>
+      <w:r>
+        <w:rPr>
+          <w:rFonts w:hint="eastAsia"/>
+          <w:color w:val="000000" w:themeColor="text1"/>
+          <w:lang w:val="en-US" w:eastAsia="zh-CN"/>
+        </w:rPr>
+        <w:t xml:space="preserve"> </w:t>
+      </w:r>
+      <w:r>
+        <w:rPr>
+          <w:color w:val="000000" w:themeColor="text1"/>
+          <w:lang w:val="en-US" w:eastAsia="zh-CN"/>
+        </w:rPr>
+        <w:t xml:space="preserve">tic and toc functions. By applying the modulo operation (mod) to the </w:t>
+      </w:r>
+      <w:r>
+        <w:rPr>
+          <w:rFonts w:hint="eastAsia"/>
+          <w:color w:val="000000" w:themeColor="text1"/>
+          <w:lang w:val="en-US" w:eastAsia="zh-CN"/>
+        </w:rPr>
+        <w:t>running</w:t>
+      </w:r>
+      <w:r>
+        <w:rPr>
+          <w:color w:val="000000" w:themeColor="text1"/>
+          <w:lang w:val="en-US" w:eastAsia="zh-CN"/>
+        </w:rPr>
+        <w:t xml:space="preserve"> time, the LEDs could blink asynchronously without interrupting the 1-second temperature sampling. </w:t>
       </w:r>
     </w:p>
     <w:p>
       <w:pPr>
         <w:spacing w:line="259" w:lineRule="auto"/>
-        <w:jc w:val="both"/>
+        <w:rPr>
+          <w:color w:val="000000" w:themeColor="text1"/>
+          <w:lang w:val="en-US" w:eastAsia="zh-CN"/>
+        </w:rPr>
+      </w:pPr>
+      <w:r>
+        <w:rPr>
+          <w:color w:val="000000" w:themeColor="text1"/>
+          <w:lang w:val="en-US" w:eastAsia="zh-CN"/>
+        </w:rPr>
+        <w:t xml:space="preserve">Additionally, to address the sensor noise in Task 3, a 10-second sliding window algorithm was implemented. This smoothed the data, allowing for </w:t>
+      </w:r>
+      <w:r>
+        <w:rPr>
+          <w:rFonts w:hint="eastAsia"/>
+          <w:color w:val="000000" w:themeColor="text1"/>
+          <w:lang w:val="en-US" w:eastAsia="zh-CN"/>
+        </w:rPr>
+        <w:t xml:space="preserve">more </w:t>
+      </w:r>
+      <w:r>
+        <w:rPr>
+          <w:color w:val="000000" w:themeColor="text1"/>
+          <w:lang w:val="en-US" w:eastAsia="zh-CN"/>
+        </w:rPr>
+        <w:t xml:space="preserve">accurate and stable calculation of the temperature rate of change and </w:t>
+      </w:r>
+      <w:r>
+        <w:rPr>
+          <w:rFonts w:hint="eastAsia"/>
+          <w:color w:val="000000" w:themeColor="text1"/>
+          <w:lang w:val="en-US" w:eastAsia="zh-CN"/>
+        </w:rPr>
+        <w:t xml:space="preserve">more </w:t>
+      </w:r>
+      <w:r>
+        <w:rPr>
+          <w:color w:val="000000" w:themeColor="text1"/>
+          <w:lang w:val="en-US" w:eastAsia="zh-CN"/>
+        </w:rPr>
+        <w:t>reliable 5-minute predictions.</w:t>
+      </w:r>
+    </w:p>
+    <w:p>
+      <w:pPr>
+        <w:spacing w:line="259" w:lineRule="auto"/>
         <w:rPr>
           <w:color w:val="000000" w:themeColor="text1"/>
           <w:lang w:val="en-US" w:eastAsia="zh-CN"/>
@@ -606,7 +690,7 @@
           <w:color w:val="000000" w:themeColor="text1"/>
           <w:lang w:val="en-US" w:eastAsia="zh-CN"/>
         </w:rPr>
-        <w:t>Strengths:</w:t>
+        <w:t>Limitations:</w:t>
       </w:r>
       <w:r>
         <w:rPr>
@@ -614,40 +698,88 @@
           <w:lang w:val="en-US" w:eastAsia="zh-CN"/>
         </w:rPr>
         <w:br/>
-        <w:t>To overcome the blocking issue, a robust non-blocking timer was successfully developed using MATLAB's tic and toc functions. By applying the modulo operation (mod) to the elapsed time, the LEDs could blink asynchronously without interrupting the 1-second temperature sampling. Additionally, to address the sensor noise in Task 3, a 10-second sliding window algorithm was implemented. This successfully smoothed the data, allowing for accurate and stable calculation of the temperature derivative (rate of change) and reliable 5-minute predictions.</w:t>
+        <w:t xml:space="preserve">The prediction algorithm assumes that the rate of temperature change remains strictly linear and constant over a 5-minute period. </w:t>
+      </w:r>
+      <w:r>
+        <w:rPr>
+          <w:rFonts w:hint="eastAsia"/>
+          <w:color w:val="000000" w:themeColor="text1"/>
+          <w:lang w:val="en-US" w:eastAsia="zh-CN"/>
+        </w:rPr>
+        <w:t>But i</w:t>
+      </w:r>
+      <w:r>
+        <w:rPr>
+          <w:color w:val="000000" w:themeColor="text1"/>
+          <w:lang w:val="en-US" w:eastAsia="zh-CN"/>
+        </w:rPr>
+        <w:t xml:space="preserve">n real thermodynamic systems, temperature changes </w:t>
+      </w:r>
+      <w:r>
+        <w:rPr>
+          <w:rFonts w:hint="eastAsia"/>
+          <w:color w:val="000000" w:themeColor="text1"/>
+          <w:lang w:val="en-US" w:eastAsia="zh-CN"/>
+        </w:rPr>
+        <w:t>may</w:t>
+      </w:r>
+      <w:r>
+        <w:rPr>
+          <w:color w:val="000000" w:themeColor="text1"/>
+          <w:lang w:val="en-US" w:eastAsia="zh-CN"/>
+        </w:rPr>
+        <w:t xml:space="preserve"> follow exponential or logarithmic curves, meaning the current linear </w:t>
+      </w:r>
+      <w:r>
+        <w:rPr>
+          <w:rFonts w:hint="eastAsia"/>
+          <w:color w:val="000000" w:themeColor="text1"/>
+          <w:lang w:val="en-US" w:eastAsia="zh-CN"/>
+        </w:rPr>
+        <w:t>prediction</w:t>
+      </w:r>
+      <w:r>
+        <w:rPr>
+          <w:color w:val="000000" w:themeColor="text1"/>
+          <w:lang w:val="en-US" w:eastAsia="zh-CN"/>
+        </w:rPr>
+        <w:t xml:space="preserve"> could overestimate the final temperature. </w:t>
       </w:r>
     </w:p>
     <w:p>
       <w:pPr>
         <w:spacing w:line="259" w:lineRule="auto"/>
-        <w:jc w:val="both"/>
-        <w:rPr>
-          <w:color w:val="000000" w:themeColor="text1"/>
-          <w:lang w:val="en-US" w:eastAsia="zh-CN"/>
-        </w:rPr>
-      </w:pPr>
-      <w:r>
-        <w:rPr>
-          <w:b/>
-          <w:bCs/>
-          <w:color w:val="000000" w:themeColor="text1"/>
-          <w:lang w:val="en-US" w:eastAsia="zh-CN"/>
-        </w:rPr>
-        <w:t>Limitations:</w:t>
-      </w:r>
-      <w:r>
-        <w:rPr>
-          <w:color w:val="000000" w:themeColor="text1"/>
-          <w:lang w:val="en-US" w:eastAsia="zh-CN"/>
-        </w:rPr>
-        <w:br/>
-        <w:t>The prediction algorithm assumes that the rate of temperature change remains strictly linear and constant over a 5-minute period. In real thermodynamic systems, temperature changes often follow exponential or logarithmic curves, meaning the current linear extrapolation could overestimate the final temperature. Furthermore, the MCP9700A analog thermistor has inherent electrical noise, limiting the ultimate precision of the readings compared to digital counterparts.</w:t>
+        <w:rPr>
+          <w:color w:val="000000" w:themeColor="text1"/>
+          <w:lang w:val="en-US" w:eastAsia="zh-CN"/>
+        </w:rPr>
+      </w:pPr>
+      <w:r>
+        <w:rPr>
+          <w:color w:val="000000" w:themeColor="text1"/>
+          <w:lang w:val="en-US" w:eastAsia="zh-CN"/>
+        </w:rPr>
+        <w:t xml:space="preserve">Furthermore, the MCP9700A analog thermistor has </w:t>
+      </w:r>
+      <w:r>
+        <w:rPr>
+          <w:rFonts w:hint="eastAsia"/>
+          <w:color w:val="000000" w:themeColor="text1"/>
+          <w:lang w:val="en-US" w:eastAsia="zh-CN"/>
+        </w:rPr>
+        <w:t>obvious</w:t>
+      </w:r>
+      <w:r>
+        <w:rPr>
+          <w:color w:val="000000" w:themeColor="text1"/>
+          <w:lang w:val="en-US" w:eastAsia="zh-CN"/>
+        </w:rPr>
+        <w:t xml:space="preserve"> electrical noise, limiting the ultimate precision of the readings compared to digital counterparts.</w:t>
       </w:r>
     </w:p>
     <w:p>
       <w:pPr>
         <w:spacing w:line="259" w:lineRule="auto"/>
-        <w:jc w:val="both"/>
         <w:rPr>
           <w:color w:val="000000" w:themeColor="text1"/>
           <w:lang w:val="en-US" w:eastAsia="zh-CN"/>
@@ -687,7 +819,39 @@
           <w:lang w:val="en-US" w:eastAsia="zh-CN"/>
         </w:rPr>
         <w:br/>
-        <w:t>For future iterations, replacing the analog thermistor with a high-precision digital sensor (such as the DS18B20) would significantly reduce signal noise. Moreover, instead of a simple linear extrapolation, advanced algorithms like a Kalman Filter or exponential smoothing could be introduced to predict future temperatures more accurately. Finally, implementing a PID (Proportional-Integral-Derivative) controller algorithm in the code would allow the system to actively regulate a cooling/heating mechanism, rather than simply triggering passive visual alarms.</w:t>
+        <w:t>For future iterations, replacing the analog thermistor with a high-precision digital sensor would significantly reduce signal noise.</w:t>
+      </w:r>
+    </w:p>
+    <w:p>
+      <w:pPr>
+        <w:spacing w:line="259" w:lineRule="auto"/>
+        <w:rPr>
+          <w:rFonts w:hint="eastAsia"/>
+          <w:color w:val="000000" w:themeColor="text1"/>
+          <w:lang w:val="en-US" w:eastAsia="zh-CN"/>
+        </w:rPr>
+      </w:pPr>
+      <w:r>
+        <w:rPr>
+          <w:color w:val="000000" w:themeColor="text1"/>
+          <w:lang w:val="en-US" w:eastAsia="zh-CN"/>
+        </w:rPr>
+        <w:t>Moreover, instead of a simple linear extrapolation, advanced algorithms like a Kalman Filter or exponential smoothing could be introduced to predict future temperatures more</w:t>
+      </w:r>
+      <w:r>
+        <w:rPr>
+          <w:rFonts w:hint="eastAsia"/>
+          <w:color w:val="000000" w:themeColor="text1"/>
+          <w:lang w:val="en-US" w:eastAsia="zh-CN"/>
+        </w:rPr>
+        <w:t xml:space="preserve"> </w:t>
+      </w:r>
+      <w:r>
+        <w:rPr>
+          <w:color w:val="000000" w:themeColor="text1"/>
+          <w:lang w:val="en-US" w:eastAsia="zh-CN"/>
+        </w:rPr>
+        <w:t>accurately.</w:t>
       </w:r>
     </w:p>
     <w:p>
@@ -841,7 +1005,7 @@
             </mc:Choice>
             <mc:Fallback>
               <w:pict>
-                <v:line w14:anchorId="20FBC31D" id="Straight Connector 4" o:spid="_x0000_s1026" style="position:absolute;z-index:251658243;visibility:visible;mso-wrap-style:square;mso-wrap-distance-left:9pt;mso-wrap-distance-top:0;mso-wrap-distance-right:9pt;mso-wrap-distance-bottom:0;mso-position-horizontal:absolute;mso-position-horizontal-relative:text;mso-position-vertical:absolute;mso-position-vertical-relative:text" from="-.75pt,-10.2pt" to="454.5pt,-10.2pt" o:gfxdata="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" strokecolor="#4472c4 [3204]" strokeweight=".5pt">
+                <v:line w14:anchorId="49EEA3E7" id="Straight Connector 4" o:spid="_x0000_s1026" style="position:absolute;z-index:251658243;visibility:visible;mso-wrap-style:square;mso-wrap-distance-left:9pt;mso-wrap-distance-top:0;mso-wrap-distance-right:9pt;mso-wrap-distance-bottom:0;mso-position-horizontal:absolute;mso-position-horizontal-relative:text;mso-position-vertical:absolute;mso-position-vertical-relative:text" from="-.75pt,-10.2pt" to="454.5pt,-10.2pt" o:gfxdata="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" strokecolor="#4472c4 [3204]" strokeweight=".5pt">
                   <v:stroke joinstyle="miter"/>
                 </v:line>
               </w:pict>
@@ -943,7 +1107,33 @@
   <w:p>
     <w:pPr>
       <w:pStyle w:val="a6"/>
+      <w:rPr>
+        <w:rFonts w:hint="eastAsia"/>
+        <w:sz w:val="20"/>
+        <w:szCs w:val="20"/>
+        <w:lang w:eastAsia="zh-CN"/>
+      </w:rPr>
     </w:pPr>
+    <w:proofErr w:type="spellStart"/>
+    <w:r>
+      <w:rPr>
+        <w:rFonts w:hint="eastAsia"/>
+        <w:sz w:val="20"/>
+        <w:szCs w:val="20"/>
+        <w:lang w:eastAsia="zh-CN"/>
+      </w:rPr>
+      <w:t>Jiekai</w:t>
+    </w:r>
+    <w:proofErr w:type="spellEnd"/>
+    <w:r>
+      <w:rPr>
+        <w:rFonts w:hint="eastAsia"/>
+        <w:sz w:val="20"/>
+        <w:szCs w:val="20"/>
+        <w:lang w:eastAsia="zh-CN"/>
+      </w:rPr>
+      <w:t xml:space="preserve"> Song, 20717659</w:t>
+    </w:r>
   </w:p>
 </w:ftr>
 </file>

</xml_diff>

<commit_message>
Optimized the doc file
</commit_message>
<xml_diff>
--- a/CW2/MATLAB Coursework 2  Word Template.docx
+++ b/CW2/MATLAB Coursework 2  Word Template.docx
@@ -5,9 +5,6 @@
     <w:p>
       <w:pPr>
         <w:pStyle w:val="a8"/>
-        <w:rPr>
-          <w:rFonts w:hint="eastAsia"/>
-        </w:rPr>
       </w:pPr>
       <w:r>
         <w:t>AERO1005 MATLAB Coursework 2</w:t>
@@ -15,21 +12,30 @@
     </w:p>
     <w:p>
       <w:pPr>
+        <w:rPr>
+          <w:b/>
+          <w:bCs/>
+          <w:lang w:eastAsia="zh-CN"/>
+        </w:rPr>
+      </w:pPr>
+      <w:r>
+        <w:rPr>
+          <w:b/>
+          <w:bCs/>
+        </w:rPr>
+        <w:t xml:space="preserve">Author: </w:t>
+      </w:r>
+      <w:proofErr w:type="spellStart"/>
+      <w:r>
         <w:rPr>
           <w:rFonts w:hint="eastAsia"/>
           <w:b/>
           <w:bCs/>
           <w:lang w:eastAsia="zh-CN"/>
         </w:rPr>
-      </w:pPr>
-      <w:r>
-        <w:rPr>
-          <w:b/>
-          <w:bCs/>
-        </w:rPr>
-        <w:t xml:space="preserve">Author: </w:t>
-      </w:r>
-      <w:proofErr w:type="spellStart"/>
+        <w:t>Jiekai</w:t>
+      </w:r>
+      <w:proofErr w:type="spellEnd"/>
       <w:r>
         <w:rPr>
           <w:rFonts w:hint="eastAsia"/>
@@ -37,9 +43,24 @@
           <w:bCs/>
           <w:lang w:eastAsia="zh-CN"/>
         </w:rPr>
-        <w:t>Jiekai</w:t>
-      </w:r>
-      <w:proofErr w:type="spellEnd"/>
+        <w:t xml:space="preserve"> Song</w:t>
+      </w:r>
+    </w:p>
+    <w:p>
+      <w:pPr>
+        <w:rPr>
+          <w:b/>
+          <w:bCs/>
+          <w:lang w:eastAsia="zh-CN"/>
+        </w:rPr>
+      </w:pPr>
+      <w:r>
+        <w:rPr>
+          <w:b/>
+          <w:bCs/>
+        </w:rPr>
+        <w:t xml:space="preserve">Student ID: </w:t>
+      </w:r>
       <w:r>
         <w:rPr>
           <w:rFonts w:hint="eastAsia"/>
@@ -47,65 +68,37 @@
           <w:bCs/>
           <w:lang w:eastAsia="zh-CN"/>
         </w:rPr>
-        <w:t xml:space="preserve"> Song</w:t>
-      </w:r>
-    </w:p>
-    <w:p>
-      <w:pPr>
+        <w:t>20717659</w:t>
+      </w:r>
+    </w:p>
+    <w:p>
+      <w:pPr>
+        <w:rPr>
+          <w:b/>
+          <w:bCs/>
+          <w:lang w:eastAsia="zh-CN"/>
+        </w:rPr>
+      </w:pPr>
+      <w:r>
+        <w:rPr>
+          <w:b/>
+          <w:bCs/>
+        </w:rPr>
+        <w:t xml:space="preserve">Date of report: </w:t>
+      </w:r>
+      <w:r>
         <w:rPr>
           <w:rFonts w:hint="eastAsia"/>
           <w:b/>
           <w:bCs/>
           <w:lang w:eastAsia="zh-CN"/>
         </w:rPr>
-      </w:pPr>
-      <w:r>
-        <w:rPr>
-          <w:b/>
-          <w:bCs/>
-        </w:rPr>
-        <w:t xml:space="preserve">Student ID: </w:t>
-      </w:r>
-      <w:r>
-        <w:rPr>
-          <w:rFonts w:hint="eastAsia"/>
-          <w:b/>
-          <w:bCs/>
-          <w:lang w:eastAsia="zh-CN"/>
-        </w:rPr>
-        <w:t>20717659</w:t>
-      </w:r>
-    </w:p>
-    <w:p>
-      <w:pPr>
-        <w:rPr>
-          <w:rFonts w:hint="eastAsia"/>
-          <w:b/>
-          <w:bCs/>
-          <w:lang w:eastAsia="zh-CN"/>
-        </w:rPr>
-      </w:pPr>
-      <w:r>
-        <w:rPr>
-          <w:b/>
-          <w:bCs/>
-        </w:rPr>
-        <w:t xml:space="preserve">Date of report: </w:t>
-      </w:r>
-      <w:r>
-        <w:rPr>
-          <w:rFonts w:hint="eastAsia"/>
-          <w:b/>
-          <w:bCs/>
-          <w:lang w:eastAsia="zh-CN"/>
-        </w:rPr>
         <w:t>2026/05/03</w:t>
       </w:r>
     </w:p>
     <w:p>
       <w:pPr>
         <w:rPr>
-          <w:rFonts w:hint="eastAsia"/>
           <w:highlight w:val="cyan"/>
         </w:rPr>
       </w:pPr>
@@ -128,7 +121,6 @@
         <w:spacing w:line="259" w:lineRule="auto"/>
         <w:jc w:val="center"/>
         <w:rPr>
-          <w:rFonts w:hint="eastAsia"/>
           <w:color w:val="000000" w:themeColor="text1"/>
           <w:highlight w:val="cyan"/>
           <w:lang w:eastAsia="zh-CN"/>
@@ -230,7 +222,7 @@
           <w:lang w:eastAsia="zh-CN"/>
         </w:rPr>
         <w:drawing>
-          <wp:inline distT="0" distB="0" distL="0" distR="0" wp14:anchorId="2A6B5CE6" wp14:editId="4FB32FA3">
+          <wp:inline distT="0" distB="0" distL="0" distR="0" wp14:anchorId="2A6B5CE6" wp14:editId="2E2882CE">
             <wp:extent cx="3307576" cy="3108960"/>
             <wp:effectExtent l="0" t="0" r="7620" b="0"/>
             <wp:docPr id="506415544" name="图片 12"/>
@@ -439,7 +431,6 @@
         <w:spacing w:line="259" w:lineRule="auto"/>
         <w:jc w:val="center"/>
         <w:rPr>
-          <w:rFonts w:hint="eastAsia"/>
           <w:b/>
           <w:bCs/>
           <w:color w:val="000000" w:themeColor="text1"/>
@@ -503,355 +494,23 @@
       <w:pPr>
         <w:spacing w:line="259" w:lineRule="auto"/>
         <w:rPr>
-          <w:color w:val="000000" w:themeColor="text1"/>
-          <w:lang w:val="en-US" w:eastAsia="zh-CN"/>
-        </w:rPr>
-      </w:pPr>
-      <w:r>
-        <w:rPr>
-          <w:b/>
-          <w:bCs/>
-          <w:color w:val="000000" w:themeColor="text1"/>
-          <w:lang w:val="en-US" w:eastAsia="zh-CN"/>
-        </w:rPr>
-        <w:lastRenderedPageBreak/>
-        <w:t>Challenges:</w:t>
-      </w:r>
-      <w:r>
-        <w:rPr>
-          <w:color w:val="000000" w:themeColor="text1"/>
-          <w:lang w:val="en-US" w:eastAsia="zh-CN"/>
-        </w:rPr>
-        <w:br/>
-        <w:t>The most significant challenge in this project was Task 2. Initially, using the </w:t>
-      </w:r>
-      <w:proofErr w:type="gramStart"/>
-      <w:r>
-        <w:rPr>
-          <w:color w:val="000000" w:themeColor="text1"/>
-          <w:lang w:val="en-US" w:eastAsia="zh-CN"/>
-        </w:rPr>
-        <w:t>pause(</w:t>
-      </w:r>
-      <w:proofErr w:type="gramEnd"/>
-      <w:r>
-        <w:rPr>
-          <w:color w:val="000000" w:themeColor="text1"/>
-          <w:lang w:val="en-US" w:eastAsia="zh-CN"/>
-        </w:rPr>
-        <w:t xml:space="preserve">) command to control the LED blinking sequence caused the entire program to halt, delaying the temperature sampling interval and freezing the live graph. </w:t>
-      </w:r>
-    </w:p>
-    <w:p>
-      <w:pPr>
-        <w:spacing w:line="259" w:lineRule="auto"/>
-        <w:rPr>
-          <w:color w:val="000000" w:themeColor="text1"/>
-          <w:lang w:val="en-US" w:eastAsia="zh-CN"/>
-        </w:rPr>
-      </w:pPr>
-      <w:r>
-        <w:rPr>
-          <w:color w:val="000000" w:themeColor="text1"/>
-          <w:lang w:val="en-US" w:eastAsia="zh-CN"/>
-        </w:rPr>
-        <w:t>Another challenge emerged in Task 3, where raw temperature differentials between consecutive seconds were too erratic due to analog sensor noise, causing the LEDs to trigger incorrectly.</w:t>
-      </w:r>
-    </w:p>
-    <w:p>
-      <w:pPr>
-        <w:spacing w:line="259" w:lineRule="auto"/>
-        <w:rPr>
-          <w:color w:val="000000" w:themeColor="text1"/>
-          <w:lang w:val="en-US" w:eastAsia="zh-CN"/>
-        </w:rPr>
-      </w:pPr>
-      <w:r>
-        <w:rPr>
-          <w:b/>
-          <w:bCs/>
-          <w:color w:val="000000" w:themeColor="text1"/>
-          <w:lang w:val="en-US" w:eastAsia="zh-CN"/>
-        </w:rPr>
-        <w:t>Strengths:</w:t>
-      </w:r>
-      <w:r>
-        <w:rPr>
-          <w:color w:val="000000" w:themeColor="text1"/>
-          <w:lang w:val="en-US" w:eastAsia="zh-CN"/>
-        </w:rPr>
-        <w:br/>
-        <w:t>To</w:t>
-      </w:r>
-      <w:r>
-        <w:rPr>
-          <w:rFonts w:hint="eastAsia"/>
-          <w:color w:val="000000" w:themeColor="text1"/>
-          <w:lang w:val="en-US" w:eastAsia="zh-CN"/>
-        </w:rPr>
-        <w:t xml:space="preserve"> </w:t>
-      </w:r>
-      <w:r>
-        <w:rPr>
-          <w:color w:val="000000" w:themeColor="text1"/>
-          <w:lang w:val="en-US" w:eastAsia="zh-CN"/>
-        </w:rPr>
-        <w:t>overcome the blocking issue, a non-blocking timer was developed using</w:t>
-      </w:r>
-      <w:r>
-        <w:rPr>
-          <w:rFonts w:hint="eastAsia"/>
-          <w:color w:val="000000" w:themeColor="text1"/>
-          <w:lang w:val="en-US" w:eastAsia="zh-CN"/>
-        </w:rPr>
-        <w:t xml:space="preserve"> </w:t>
-      </w:r>
-      <w:r>
-        <w:rPr>
-          <w:color w:val="000000" w:themeColor="text1"/>
-          <w:lang w:val="en-US" w:eastAsia="zh-CN"/>
-        </w:rPr>
-        <w:t xml:space="preserve">tic and toc functions. By applying the modulo operation (mod) to the </w:t>
-      </w:r>
-      <w:r>
-        <w:rPr>
-          <w:rFonts w:hint="eastAsia"/>
-          <w:color w:val="000000" w:themeColor="text1"/>
-          <w:lang w:val="en-US" w:eastAsia="zh-CN"/>
-        </w:rPr>
-        <w:t>running</w:t>
-      </w:r>
-      <w:r>
-        <w:rPr>
-          <w:color w:val="000000" w:themeColor="text1"/>
-          <w:lang w:val="en-US" w:eastAsia="zh-CN"/>
-        </w:rPr>
-        <w:t xml:space="preserve"> time, the LEDs could blink asynchronously without interrupting the 1-second temperature sampling. </w:t>
-      </w:r>
-    </w:p>
-    <w:p>
-      <w:pPr>
-        <w:spacing w:line="259" w:lineRule="auto"/>
-        <w:rPr>
-          <w:color w:val="000000" w:themeColor="text1"/>
-          <w:lang w:val="en-US" w:eastAsia="zh-CN"/>
-        </w:rPr>
-      </w:pPr>
-      <w:r>
-        <w:rPr>
-          <w:color w:val="000000" w:themeColor="text1"/>
-          <w:lang w:val="en-US" w:eastAsia="zh-CN"/>
-        </w:rPr>
-        <w:t xml:space="preserve">Additionally, to address the sensor noise in Task 3, a 10-second sliding window algorithm was implemented. This smoothed the data, allowing for </w:t>
-      </w:r>
-      <w:r>
-        <w:rPr>
-          <w:rFonts w:hint="eastAsia"/>
-          <w:color w:val="000000" w:themeColor="text1"/>
-          <w:lang w:val="en-US" w:eastAsia="zh-CN"/>
-        </w:rPr>
-        <w:t xml:space="preserve">more </w:t>
-      </w:r>
-      <w:r>
-        <w:rPr>
-          <w:color w:val="000000" w:themeColor="text1"/>
-          <w:lang w:val="en-US" w:eastAsia="zh-CN"/>
-        </w:rPr>
-        <w:t xml:space="preserve">accurate and stable calculation of the temperature rate of change and </w:t>
-      </w:r>
-      <w:r>
-        <w:rPr>
-          <w:rFonts w:hint="eastAsia"/>
-          <w:color w:val="000000" w:themeColor="text1"/>
-          <w:lang w:val="en-US" w:eastAsia="zh-CN"/>
-        </w:rPr>
-        <w:t xml:space="preserve">more </w:t>
-      </w:r>
-      <w:r>
-        <w:rPr>
-          <w:color w:val="000000" w:themeColor="text1"/>
-          <w:lang w:val="en-US" w:eastAsia="zh-CN"/>
-        </w:rPr>
-        <w:t>reliable 5-minute predictions.</w:t>
-      </w:r>
-    </w:p>
-    <w:p>
-      <w:pPr>
-        <w:spacing w:line="259" w:lineRule="auto"/>
-        <w:rPr>
-          <w:color w:val="000000" w:themeColor="text1"/>
-          <w:lang w:val="en-US" w:eastAsia="zh-CN"/>
-        </w:rPr>
-      </w:pPr>
-      <w:r>
-        <w:rPr>
-          <w:b/>
-          <w:bCs/>
-          <w:color w:val="000000" w:themeColor="text1"/>
-          <w:lang w:val="en-US" w:eastAsia="zh-CN"/>
-        </w:rPr>
-        <w:t>Limitations:</w:t>
-      </w:r>
-      <w:r>
-        <w:rPr>
-          <w:color w:val="000000" w:themeColor="text1"/>
-          <w:lang w:val="en-US" w:eastAsia="zh-CN"/>
-        </w:rPr>
-        <w:br/>
-        <w:t xml:space="preserve">The prediction algorithm assumes that the rate of temperature change remains strictly linear and constant over a 5-minute period. </w:t>
-      </w:r>
-      <w:r>
-        <w:rPr>
-          <w:rFonts w:hint="eastAsia"/>
-          <w:color w:val="000000" w:themeColor="text1"/>
-          <w:lang w:val="en-US" w:eastAsia="zh-CN"/>
-        </w:rPr>
-        <w:t>But i</w:t>
-      </w:r>
-      <w:r>
-        <w:rPr>
-          <w:color w:val="000000" w:themeColor="text1"/>
-          <w:lang w:val="en-US" w:eastAsia="zh-CN"/>
-        </w:rPr>
-        <w:t xml:space="preserve">n real thermodynamic systems, temperature changes </w:t>
-      </w:r>
-      <w:r>
-        <w:rPr>
-          <w:rFonts w:hint="eastAsia"/>
-          <w:color w:val="000000" w:themeColor="text1"/>
-          <w:lang w:val="en-US" w:eastAsia="zh-CN"/>
-        </w:rPr>
-        <w:t>may</w:t>
-      </w:r>
-      <w:r>
-        <w:rPr>
-          <w:color w:val="000000" w:themeColor="text1"/>
-          <w:lang w:val="en-US" w:eastAsia="zh-CN"/>
-        </w:rPr>
-        <w:t xml:space="preserve"> follow exponential or logarithmic curves, meaning the current linear </w:t>
-      </w:r>
-      <w:r>
-        <w:rPr>
-          <w:rFonts w:hint="eastAsia"/>
-          <w:color w:val="000000" w:themeColor="text1"/>
-          <w:lang w:val="en-US" w:eastAsia="zh-CN"/>
-        </w:rPr>
-        <w:t>prediction</w:t>
-      </w:r>
-      <w:r>
-        <w:rPr>
-          <w:color w:val="000000" w:themeColor="text1"/>
-          <w:lang w:val="en-US" w:eastAsia="zh-CN"/>
-        </w:rPr>
-        <w:t xml:space="preserve"> could overestimate the final temperature. </w:t>
-      </w:r>
-    </w:p>
-    <w:p>
-      <w:pPr>
-        <w:spacing w:line="259" w:lineRule="auto"/>
-        <w:rPr>
-          <w:color w:val="000000" w:themeColor="text1"/>
-          <w:lang w:val="en-US" w:eastAsia="zh-CN"/>
-        </w:rPr>
-      </w:pPr>
-      <w:r>
-        <w:rPr>
-          <w:color w:val="000000" w:themeColor="text1"/>
-          <w:lang w:val="en-US" w:eastAsia="zh-CN"/>
-        </w:rPr>
-        <w:t xml:space="preserve">Furthermore, the MCP9700A analog thermistor has </w:t>
-      </w:r>
-      <w:r>
-        <w:rPr>
-          <w:rFonts w:hint="eastAsia"/>
-          <w:color w:val="000000" w:themeColor="text1"/>
-          <w:lang w:val="en-US" w:eastAsia="zh-CN"/>
-        </w:rPr>
-        <w:t>obvious</w:t>
-      </w:r>
-      <w:r>
-        <w:rPr>
-          <w:color w:val="000000" w:themeColor="text1"/>
-          <w:lang w:val="en-US" w:eastAsia="zh-CN"/>
-        </w:rPr>
-        <w:t xml:space="preserve"> electrical noise, limiting the ultimate precision of the readings compared to digital counterparts.</w:t>
-      </w:r>
-    </w:p>
-    <w:p>
-      <w:pPr>
-        <w:spacing w:line="259" w:lineRule="auto"/>
-        <w:rPr>
-          <w:color w:val="000000" w:themeColor="text1"/>
-          <w:lang w:val="en-US" w:eastAsia="zh-CN"/>
-        </w:rPr>
-      </w:pPr>
-      <w:r>
-        <w:rPr>
-          <w:b/>
-          <w:bCs/>
-          <w:color w:val="000000" w:themeColor="text1"/>
-          <w:lang w:val="en-US" w:eastAsia="zh-CN"/>
-        </w:rPr>
-        <w:t>Suggested</w:t>
-      </w:r>
-      <w:r>
-        <w:rPr>
           <w:rFonts w:hint="eastAsia"/>
           <w:b/>
           <w:bCs/>
           <w:color w:val="000000" w:themeColor="text1"/>
           <w:lang w:val="en-US" w:eastAsia="zh-CN"/>
         </w:rPr>
-        <w:t xml:space="preserve"> </w:t>
-      </w:r>
-      <w:r>
-        <w:rPr>
+      </w:pPr>
+      <w:r>
+        <w:rPr>
+          <w:rFonts w:hint="eastAsia"/>
           <w:b/>
           <w:bCs/>
           <w:color w:val="000000" w:themeColor="text1"/>
           <w:lang w:val="en-US" w:eastAsia="zh-CN"/>
         </w:rPr>
-        <w:t>Future Improvements:</w:t>
-      </w:r>
-      <w:r>
-        <w:rPr>
-          <w:color w:val="000000" w:themeColor="text1"/>
-          <w:lang w:val="en-US" w:eastAsia="zh-CN"/>
-        </w:rPr>
-        <w:br/>
-        <w:t>For future iterations, replacing the analog thermistor with a high-precision digital sensor would significantly reduce signal noise.</w:t>
-      </w:r>
-    </w:p>
-    <w:p>
-      <w:pPr>
-        <w:spacing w:line="259" w:lineRule="auto"/>
-        <w:rPr>
-          <w:rFonts w:hint="eastAsia"/>
-          <w:color w:val="000000" w:themeColor="text1"/>
-          <w:lang w:val="en-US" w:eastAsia="zh-CN"/>
-        </w:rPr>
-      </w:pPr>
-      <w:r>
-        <w:rPr>
-          <w:color w:val="000000" w:themeColor="text1"/>
-          <w:lang w:val="en-US" w:eastAsia="zh-CN"/>
-        </w:rPr>
-        <w:t>Moreover, instead of a simple linear extrapolation, advanced algorithms like a Kalman Filter or exponential smoothing could be introduced to predict future temperatures more</w:t>
-      </w:r>
-      <w:r>
-        <w:rPr>
-          <w:rFonts w:hint="eastAsia"/>
-          <w:color w:val="000000" w:themeColor="text1"/>
-          <w:lang w:val="en-US" w:eastAsia="zh-CN"/>
-        </w:rPr>
-        <w:t xml:space="preserve"> </w:t>
-      </w:r>
-      <w:r>
-        <w:rPr>
-          <w:color w:val="000000" w:themeColor="text1"/>
-          <w:lang w:val="en-US" w:eastAsia="zh-CN"/>
-        </w:rPr>
-        <w:t>accurately.</w:t>
+        <w:lastRenderedPageBreak/>
+        <w:t>Reflective Statement:</w:t>
       </w:r>
     </w:p>
     <w:p>
@@ -859,17 +518,295 @@
         <w:spacing w:line="259" w:lineRule="auto"/>
         <w:jc w:val="both"/>
         <w:rPr>
-          <w:color w:val="000000" w:themeColor="text1"/>
-          <w:lang w:val="en-US" w:eastAsia="zh-CN"/>
-        </w:rPr>
-      </w:pPr>
+          <w:b/>
+          <w:bCs/>
+          <w:color w:val="000000" w:themeColor="text1"/>
+          <w:lang w:val="en-US" w:eastAsia="zh-CN"/>
+        </w:rPr>
+      </w:pPr>
+      <w:r>
+        <w:rPr>
+          <w:b/>
+          <w:bCs/>
+          <w:color w:val="000000" w:themeColor="text1"/>
+          <w:lang w:val="en-US" w:eastAsia="zh-CN"/>
+        </w:rPr>
+        <w:t>Challenges:</w:t>
+      </w:r>
+    </w:p>
+    <w:p>
+      <w:pPr>
+        <w:spacing w:line="259" w:lineRule="auto"/>
+        <w:rPr>
+          <w:color w:val="000000" w:themeColor="text1"/>
+          <w:lang w:val="en-US" w:eastAsia="zh-CN"/>
+        </w:rPr>
+      </w:pPr>
+      <w:r>
+        <w:rPr>
+          <w:color w:val="000000" w:themeColor="text1"/>
+          <w:lang w:val="en-US" w:eastAsia="zh-CN"/>
+        </w:rPr>
+        <w:t xml:space="preserve">The most significant challenge I faced </w:t>
+      </w:r>
+      <w:proofErr w:type="gramStart"/>
+      <w:r>
+        <w:rPr>
+          <w:color w:val="000000" w:themeColor="text1"/>
+          <w:lang w:val="en-US" w:eastAsia="zh-CN"/>
+        </w:rPr>
+        <w:t>in</w:t>
+      </w:r>
+      <w:proofErr w:type="gramEnd"/>
+      <w:r>
+        <w:rPr>
+          <w:color w:val="000000" w:themeColor="text1"/>
+          <w:lang w:val="en-US" w:eastAsia="zh-CN"/>
+        </w:rPr>
+        <w:t xml:space="preserve"> this project was Task 2. Initially, I used the </w:t>
+      </w:r>
+      <w:proofErr w:type="gramStart"/>
+      <w:r>
+        <w:rPr>
+          <w:color w:val="000000" w:themeColor="text1"/>
+          <w:lang w:val="en-US" w:eastAsia="zh-CN"/>
+        </w:rPr>
+        <w:t>pause(</w:t>
+      </w:r>
+      <w:proofErr w:type="gramEnd"/>
+      <w:r>
+        <w:rPr>
+          <w:color w:val="000000" w:themeColor="text1"/>
+          <w:lang w:val="en-US" w:eastAsia="zh-CN"/>
+        </w:rPr>
+        <w:t xml:space="preserve">) command to control the LED blinking sequence. Although this approximately achieved the basic requirements, I soon realized a flaw: what if the temperature changes while the program is executing the pause? The system would miss those changes, making it unresponsive and delaying the live graph. </w:t>
+      </w:r>
+    </w:p>
+    <w:p>
+      <w:pPr>
+        <w:spacing w:line="259" w:lineRule="auto"/>
+        <w:rPr>
+          <w:color w:val="000000" w:themeColor="text1"/>
+          <w:lang w:val="en-US" w:eastAsia="zh-CN"/>
+        </w:rPr>
+      </w:pPr>
+      <w:r>
+        <w:rPr>
+          <w:color w:val="000000" w:themeColor="text1"/>
+          <w:lang w:val="en-US" w:eastAsia="zh-CN"/>
+        </w:rPr>
+        <w:t>Another major challenge emerged in Task 3, where the raw temperature differences between consecutive seconds were too erratic due to analog sensor noise, causing the warning LEDs to trigger incorrectly.</w:t>
+      </w:r>
     </w:p>
     <w:p>
       <w:pPr>
         <w:spacing w:line="259" w:lineRule="auto"/>
         <w:jc w:val="both"/>
         <w:rPr>
+          <w:b/>
+          <w:bCs/>
+          <w:color w:val="000000" w:themeColor="text1"/>
+          <w:lang w:val="en-US" w:eastAsia="zh-CN"/>
+        </w:rPr>
+      </w:pPr>
+      <w:r>
+        <w:rPr>
+          <w:b/>
+          <w:bCs/>
+          <w:color w:val="000000" w:themeColor="text1"/>
+          <w:lang w:val="en-US" w:eastAsia="zh-CN"/>
+        </w:rPr>
+        <w:t>Strengths:</w:t>
+      </w:r>
+    </w:p>
+    <w:p>
+      <w:pPr>
+        <w:spacing w:line="259" w:lineRule="auto"/>
+        <w:rPr>
+          <w:color w:val="000000" w:themeColor="text1"/>
+          <w:lang w:val="en-US" w:eastAsia="zh-CN"/>
+        </w:rPr>
+      </w:pPr>
+      <w:r>
+        <w:rPr>
+          <w:color w:val="000000" w:themeColor="text1"/>
+          <w:lang w:val="en-US" w:eastAsia="zh-CN"/>
+        </w:rPr>
+        <w:t xml:space="preserve">To overcome the blocking issue in Task 2, I developed a non-blocking timer using tic and toc functions. By applying the modulo operation (mod) to the running time, I successfully made the LEDs blink asynchronously without interrupting the crucial 1-second temperature sampling. </w:t>
+      </w:r>
+    </w:p>
+    <w:p>
+      <w:pPr>
+        <w:spacing w:line="259" w:lineRule="auto"/>
+        <w:rPr>
+          <w:color w:val="000000" w:themeColor="text1"/>
+          <w:lang w:val="en-US" w:eastAsia="zh-CN"/>
+        </w:rPr>
+      </w:pPr>
+      <w:r>
+        <w:rPr>
+          <w:color w:val="000000" w:themeColor="text1"/>
+          <w:lang w:val="en-US" w:eastAsia="zh-CN"/>
+        </w:rPr>
+        <w:t>Additionally, to solve the sensor noise in Task 3, I implemented a 10-second sliding window algorithm (an array buffer</w:t>
+      </w:r>
+      <w:r>
+        <w:rPr>
+          <w:color w:val="000000" w:themeColor="text1"/>
+          <w:lang w:val="en-US" w:eastAsia="zh-CN"/>
+        </w:rPr>
+        <w:t>)</w:t>
+      </w:r>
+      <w:r>
+        <w:rPr>
+          <w:b/>
+          <w:bCs/>
+          <w:color w:val="2B2D31"/>
+          <w:sz w:val="21"/>
+          <w:szCs w:val="21"/>
+          <w:shd w:val="clear" w:color="auto" w:fill="FFFFFF"/>
+        </w:rPr>
+        <w:t>,</w:t>
+      </w:r>
+      <w:r>
+        <w:rPr>
           <w:rFonts w:hint="eastAsia"/>
+          <w:b/>
+          <w:bCs/>
+          <w:color w:val="2B2D31"/>
+          <w:sz w:val="21"/>
+          <w:szCs w:val="21"/>
+          <w:shd w:val="clear" w:color="auto" w:fill="FFFFFF"/>
+          <w:lang w:eastAsia="zh-CN"/>
+        </w:rPr>
+        <w:t xml:space="preserve"> </w:t>
+      </w:r>
+      <w:r>
+        <w:rPr>
+          <w:color w:val="000000" w:themeColor="text1"/>
+          <w:lang w:eastAsia="zh-CN"/>
+        </w:rPr>
+        <w:t>whose size can be easily adjusted to achieve optimum performance in different environments</w:t>
+      </w:r>
+      <w:r>
+        <w:rPr>
+          <w:color w:val="000000" w:themeColor="text1"/>
+          <w:lang w:val="en-US" w:eastAsia="zh-CN"/>
+        </w:rPr>
+        <w:t>. This smoothed the raw data perfectly, allowing my program to calculate a stable rate of change and make reliable 5-minute predictions.</w:t>
+      </w:r>
+    </w:p>
+    <w:p>
+      <w:pPr>
+        <w:spacing w:line="259" w:lineRule="auto"/>
+        <w:jc w:val="both"/>
+        <w:rPr>
+          <w:b/>
+          <w:bCs/>
+          <w:color w:val="000000" w:themeColor="text1"/>
+          <w:lang w:val="en-US" w:eastAsia="zh-CN"/>
+        </w:rPr>
+      </w:pPr>
+      <w:r>
+        <w:rPr>
+          <w:b/>
+          <w:bCs/>
+          <w:color w:val="000000" w:themeColor="text1"/>
+          <w:lang w:val="en-US" w:eastAsia="zh-CN"/>
+        </w:rPr>
+        <w:t>Limitations:</w:t>
+      </w:r>
+    </w:p>
+    <w:p>
+      <w:pPr>
+        <w:spacing w:line="259" w:lineRule="auto"/>
+        <w:rPr>
+          <w:color w:val="000000" w:themeColor="text1"/>
+          <w:lang w:val="en-US" w:eastAsia="zh-CN"/>
+        </w:rPr>
+      </w:pPr>
+      <w:r>
+        <w:rPr>
+          <w:color w:val="000000" w:themeColor="text1"/>
+          <w:lang w:val="en-US" w:eastAsia="zh-CN"/>
+        </w:rPr>
+        <w:t xml:space="preserve">One main limitation of my code is that the prediction algorithm assumes the temperature will change linearly at a constant rate over the next 5 minutes. However, in real thermodynamic systems, temperature changes often follow exponential or logarithmic curves, meaning my current linear calculation might overestimate the final temperature. </w:t>
+      </w:r>
+    </w:p>
+    <w:p>
+      <w:pPr>
+        <w:spacing w:line="259" w:lineRule="auto"/>
+        <w:rPr>
+          <w:color w:val="000000" w:themeColor="text1"/>
+          <w:lang w:val="en-US" w:eastAsia="zh-CN"/>
+        </w:rPr>
+      </w:pPr>
+      <w:r>
+        <w:rPr>
+          <w:color w:val="000000" w:themeColor="text1"/>
+          <w:lang w:val="en-US" w:eastAsia="zh-CN"/>
+        </w:rPr>
+        <w:t>Furthermore, the MCP9700A thermistor has inherent electrical noise, limiting the ultimate precision of the readings.</w:t>
+      </w:r>
+    </w:p>
+    <w:p>
+      <w:pPr>
+        <w:spacing w:line="259" w:lineRule="auto"/>
+        <w:jc w:val="both"/>
+        <w:rPr>
+          <w:b/>
+          <w:bCs/>
+          <w:color w:val="000000" w:themeColor="text1"/>
+          <w:lang w:val="en-US" w:eastAsia="zh-CN"/>
+        </w:rPr>
+      </w:pPr>
+      <w:r>
+        <w:rPr>
+          <w:b/>
+          <w:bCs/>
+          <w:color w:val="000000" w:themeColor="text1"/>
+          <w:lang w:val="en-US" w:eastAsia="zh-CN"/>
+        </w:rPr>
+        <w:t>Suggested Future Improvements:</w:t>
+      </w:r>
+    </w:p>
+    <w:p>
+      <w:pPr>
+        <w:spacing w:line="259" w:lineRule="auto"/>
+        <w:rPr>
+          <w:color w:val="000000" w:themeColor="text1"/>
+          <w:lang w:val="en-US" w:eastAsia="zh-CN"/>
+        </w:rPr>
+      </w:pPr>
+      <w:r>
+        <w:rPr>
+          <w:color w:val="000000" w:themeColor="text1"/>
+          <w:lang w:val="en-US" w:eastAsia="zh-CN"/>
+        </w:rPr>
+        <w:t xml:space="preserve">If I were to improve this project, replacing the analog thermistor with a high-precision digital sensor would be the first step to reduce signal noise. </w:t>
+      </w:r>
+    </w:p>
+    <w:p>
+      <w:pPr>
+        <w:spacing w:line="259" w:lineRule="auto"/>
+        <w:rPr>
+          <w:color w:val="000000" w:themeColor="text1"/>
+          <w:lang w:val="en-US" w:eastAsia="zh-CN"/>
+        </w:rPr>
+      </w:pPr>
+      <w:r>
+        <w:rPr>
+          <w:color w:val="000000" w:themeColor="text1"/>
+          <w:lang w:val="en-US" w:eastAsia="zh-CN"/>
+        </w:rPr>
+        <w:t>Moreover, instead of a simple linear extrapolation, I could collect a large amount of real temperature-changing data to establish an empirical curve. By matching current readings to this curve, or by introducing advanced algorithms like a Kalman Filter, the system could achieve much more accurate future temperature predictions.</w:t>
+      </w:r>
+    </w:p>
+    <w:p>
+      <w:pPr>
+        <w:spacing w:line="259" w:lineRule="auto"/>
+        <w:jc w:val="both"/>
+        <w:rPr>
           <w:color w:val="000000" w:themeColor="text1"/>
           <w:lang w:eastAsia="zh-CN"/>
         </w:rPr>
@@ -1040,7 +977,6 @@
     <w:pPr>
       <w:pStyle w:val="a6"/>
       <w:rPr>
-        <w:rFonts w:hint="eastAsia"/>
         <w:i/>
         <w:iCs/>
         <w:sz w:val="18"/>
@@ -1108,7 +1044,6 @@
     <w:pPr>
       <w:pStyle w:val="a6"/>
       <w:rPr>
-        <w:rFonts w:hint="eastAsia"/>
         <w:sz w:val="20"/>
         <w:szCs w:val="20"/>
         <w:lang w:eastAsia="zh-CN"/>

</xml_diff>

<commit_message>
refine annotations; refine doc file descriptions
</commit_message>
<xml_diff>
--- a/CW2/MATLAB Coursework 2  Word Template.docx
+++ b/CW2/MATLAB Coursework 2  Word Template.docx
@@ -5,6 +5,7 @@
     <w:p>
       <w:pPr>
         <w:pStyle w:val="a8"/>
+        <w:ind w:firstLine="720"/>
       </w:pPr>
       <w:r>
         <w:t>AERO1005 MATLAB Coursework 2</w:t>
@@ -222,7 +223,7 @@
           <w:lang w:eastAsia="zh-CN"/>
         </w:rPr>
         <w:drawing>
-          <wp:inline distT="0" distB="0" distL="0" distR="0" wp14:anchorId="2A6B5CE6" wp14:editId="2E2882CE">
+          <wp:inline distT="0" distB="0" distL="0" distR="0" wp14:anchorId="2A6B5CE6" wp14:editId="59BA3344">
             <wp:extent cx="3307576" cy="3108960"/>
             <wp:effectExtent l="0" t="0" r="7620" b="0"/>
             <wp:docPr id="506415544" name="图片 12"/>
@@ -494,7 +495,6 @@
       <w:pPr>
         <w:spacing w:line="259" w:lineRule="auto"/>
         <w:rPr>
-          <w:rFonts w:hint="eastAsia"/>
           <w:b/>
           <w:bCs/>
           <w:color w:val="000000" w:themeColor="text1"/>
@@ -516,7 +516,6 @@
     <w:p>
       <w:pPr>
         <w:spacing w:line="259" w:lineRule="auto"/>
-        <w:jc w:val="both"/>
         <w:rPr>
           <w:b/>
           <w:bCs/>
@@ -544,10 +543,18 @@
       </w:pPr>
       <w:r>
         <w:rPr>
-          <w:color w:val="000000" w:themeColor="text1"/>
-          <w:lang w:val="en-US" w:eastAsia="zh-CN"/>
-        </w:rPr>
-        <w:t xml:space="preserve">The most significant challenge I faced </w:t>
+          <w:rFonts w:hint="eastAsia"/>
+          <w:color w:val="000000" w:themeColor="text1"/>
+          <w:lang w:val="en-US" w:eastAsia="zh-CN"/>
+        </w:rPr>
+        <w:t>In t</w:t>
+      </w:r>
+      <w:r>
+        <w:rPr>
+          <w:color w:val="000000" w:themeColor="text1"/>
+          <w:lang w:val="en-US" w:eastAsia="zh-CN"/>
+        </w:rPr>
+        <w:t xml:space="preserve">ask 2. Initially, I used the </w:t>
       </w:r>
       <w:proofErr w:type="gramStart"/>
       <w:r>
@@ -555,7 +562,7 @@
           <w:color w:val="000000" w:themeColor="text1"/>
           <w:lang w:val="en-US" w:eastAsia="zh-CN"/>
         </w:rPr>
-        <w:t>in</w:t>
+        <w:t>pause(</w:t>
       </w:r>
       <w:proofErr w:type="gramEnd"/>
       <w:r>
@@ -563,23 +570,60 @@
           <w:color w:val="000000" w:themeColor="text1"/>
           <w:lang w:val="en-US" w:eastAsia="zh-CN"/>
         </w:rPr>
-        <w:t xml:space="preserve"> this project was Task 2. Initially, I used the </w:t>
-      </w:r>
-      <w:proofErr w:type="gramStart"/>
-      <w:r>
-        <w:rPr>
-          <w:color w:val="000000" w:themeColor="text1"/>
-          <w:lang w:val="en-US" w:eastAsia="zh-CN"/>
-        </w:rPr>
-        <w:t>pause(</w:t>
-      </w:r>
-      <w:proofErr w:type="gramEnd"/>
-      <w:r>
-        <w:rPr>
-          <w:color w:val="000000" w:themeColor="text1"/>
-          <w:lang w:val="en-US" w:eastAsia="zh-CN"/>
-        </w:rPr>
-        <w:t xml:space="preserve">) command to control the LED blinking sequence. Although this approximately achieved the basic requirements, I soon realized a flaw: what if the temperature changes while the program is executing the pause? The system would miss those changes, making it unresponsive and delaying the live graph. </w:t>
+        <w:t xml:space="preserve">) command to control the LED blinking. Although this met the basic requirements, I realized </w:t>
+      </w:r>
+      <w:r>
+        <w:rPr>
+          <w:rFonts w:hint="eastAsia"/>
+          <w:color w:val="000000" w:themeColor="text1"/>
+          <w:lang w:val="en-US" w:eastAsia="zh-CN"/>
+        </w:rPr>
+        <w:t>that</w:t>
+      </w:r>
+      <w:r>
+        <w:rPr>
+          <w:rFonts w:hint="eastAsia"/>
+          <w:color w:val="000000" w:themeColor="text1"/>
+          <w:lang w:val="en-US" w:eastAsia="zh-CN"/>
+        </w:rPr>
+        <w:t xml:space="preserve"> </w:t>
+      </w:r>
+      <w:r>
+        <w:rPr>
+          <w:color w:val="000000" w:themeColor="text1"/>
+          <w:lang w:val="en-US" w:eastAsia="zh-CN"/>
+        </w:rPr>
+        <w:t>the program would miss temperature changes</w:t>
+      </w:r>
+      <w:r>
+        <w:rPr>
+          <w:rFonts w:hint="eastAsia"/>
+          <w:color w:val="000000" w:themeColor="text1"/>
+          <w:lang w:val="en-US" w:eastAsia="zh-CN"/>
+        </w:rPr>
+        <w:t xml:space="preserve"> </w:t>
+      </w:r>
+      <w:r>
+        <w:rPr>
+          <w:color w:val="000000" w:themeColor="text1"/>
+          <w:lang w:val="en-US" w:eastAsia="zh-CN"/>
+        </w:rPr>
+        <w:t xml:space="preserve">during the pause, making the system </w:t>
+      </w:r>
+      <w:r>
+        <w:rPr>
+          <w:rFonts w:hint="eastAsia"/>
+          <w:color w:val="000000" w:themeColor="text1"/>
+          <w:lang w:val="en-US" w:eastAsia="zh-CN"/>
+        </w:rPr>
+        <w:t>dull</w:t>
+      </w:r>
+      <w:r>
+        <w:rPr>
+          <w:color w:val="000000" w:themeColor="text1"/>
+          <w:lang w:val="en-US" w:eastAsia="zh-CN"/>
+        </w:rPr>
+        <w:t xml:space="preserve"> and delaying the live graph. </w:t>
       </w:r>
     </w:p>
     <w:p>
@@ -595,13 +639,42 @@
           <w:color w:val="000000" w:themeColor="text1"/>
           <w:lang w:val="en-US" w:eastAsia="zh-CN"/>
         </w:rPr>
-        <w:t>Another major challenge emerged in Task 3, where the raw temperature differences between consecutive seconds were too erratic due to analog sensor noise, causing the warning LEDs to trigger incorrectly.</w:t>
+        <w:t>Another challenge</w:t>
+      </w:r>
+      <w:r>
+        <w:rPr>
+          <w:rFonts w:hint="eastAsia"/>
+          <w:color w:val="000000" w:themeColor="text1"/>
+          <w:lang w:val="en-US" w:eastAsia="zh-CN"/>
+        </w:rPr>
+        <w:t xml:space="preserve"> was</w:t>
+      </w:r>
+      <w:r>
+        <w:rPr>
+          <w:color w:val="000000" w:themeColor="text1"/>
+          <w:lang w:val="en-US" w:eastAsia="zh-CN"/>
+        </w:rPr>
+        <w:t xml:space="preserve"> in </w:t>
+      </w:r>
+      <w:r>
+        <w:rPr>
+          <w:rFonts w:hint="eastAsia"/>
+          <w:color w:val="000000" w:themeColor="text1"/>
+          <w:lang w:val="en-US" w:eastAsia="zh-CN"/>
+        </w:rPr>
+        <w:t>t</w:t>
+      </w:r>
+      <w:r>
+        <w:rPr>
+          <w:color w:val="000000" w:themeColor="text1"/>
+          <w:lang w:val="en-US" w:eastAsia="zh-CN"/>
+        </w:rPr>
+        <w:t>ask 3, where raw temperature differences between consecutive seconds were too erratic due to noise, causing the warning LEDs to trigger incorrectly.</w:t>
       </w:r>
     </w:p>
     <w:p>
       <w:pPr>
         <w:spacing w:line="259" w:lineRule="auto"/>
-        <w:jc w:val="both"/>
         <w:rPr>
           <w:b/>
           <w:bCs/>
@@ -632,7 +705,85 @@
           <w:color w:val="000000" w:themeColor="text1"/>
           <w:lang w:val="en-US" w:eastAsia="zh-CN"/>
         </w:rPr>
-        <w:t xml:space="preserve">To overcome the blocking issue in Task 2, I developed a non-blocking timer using tic and toc functions. By applying the modulo operation (mod) to the running time, I successfully made the LEDs blink asynchronously without interrupting the crucial 1-second temperature sampling. </w:t>
+        <w:t xml:space="preserve">To overcome the </w:t>
+      </w:r>
+      <w:r>
+        <w:rPr>
+          <w:rFonts w:hint="eastAsia"/>
+          <w:color w:val="000000" w:themeColor="text1"/>
+          <w:lang w:val="en-US" w:eastAsia="zh-CN"/>
+        </w:rPr>
+        <w:t xml:space="preserve">problem </w:t>
+      </w:r>
+      <w:r>
+        <w:rPr>
+          <w:rFonts w:hint="eastAsia"/>
+          <w:color w:val="000000" w:themeColor="text1"/>
+          <w:lang w:val="en-US" w:eastAsia="zh-CN"/>
+        </w:rPr>
+        <w:t xml:space="preserve">in </w:t>
+      </w:r>
+      <w:proofErr w:type="gramStart"/>
+      <w:r>
+        <w:rPr>
+          <w:rFonts w:hint="eastAsia"/>
+          <w:color w:val="000000" w:themeColor="text1"/>
+          <w:lang w:val="en-US" w:eastAsia="zh-CN"/>
+        </w:rPr>
+        <w:t>task2</w:t>
+      </w:r>
+      <w:proofErr w:type="gramEnd"/>
+      <w:r>
+        <w:rPr>
+          <w:color w:val="000000" w:themeColor="text1"/>
+          <w:lang w:val="en-US" w:eastAsia="zh-CN"/>
+        </w:rPr>
+        <w:t xml:space="preserve">, I developed a non-blocking timer using tic and toc. </w:t>
+      </w:r>
+      <w:r>
+        <w:rPr>
+          <w:rFonts w:hint="eastAsia"/>
+          <w:color w:val="000000" w:themeColor="text1"/>
+          <w:lang w:val="en-US" w:eastAsia="zh-CN"/>
+        </w:rPr>
+        <w:t>And I applied</w:t>
+      </w:r>
+      <w:r>
+        <w:rPr>
+          <w:color w:val="000000" w:themeColor="text1"/>
+          <w:lang w:val="en-US" w:eastAsia="zh-CN"/>
+        </w:rPr>
+        <w:t xml:space="preserve"> modulo operation to the running time, </w:t>
+      </w:r>
+      <w:r>
+        <w:rPr>
+          <w:rFonts w:hint="eastAsia"/>
+          <w:color w:val="000000" w:themeColor="text1"/>
+          <w:lang w:val="en-US" w:eastAsia="zh-CN"/>
+        </w:rPr>
+        <w:t>making</w:t>
+      </w:r>
+      <w:r>
+        <w:rPr>
+          <w:color w:val="000000" w:themeColor="text1"/>
+          <w:lang w:val="en-US" w:eastAsia="zh-CN"/>
+        </w:rPr>
+        <w:t xml:space="preserve"> the LEDs blink asynchronously without interrupting the 1-second temperature </w:t>
+      </w:r>
+      <w:r>
+        <w:rPr>
+          <w:rFonts w:hint="eastAsia"/>
+          <w:color w:val="000000" w:themeColor="text1"/>
+          <w:lang w:val="en-US" w:eastAsia="zh-CN"/>
+        </w:rPr>
+        <w:t>sampling</w:t>
+      </w:r>
+      <w:r>
+        <w:rPr>
+          <w:color w:val="000000" w:themeColor="text1"/>
+          <w:lang w:val="en-US" w:eastAsia="zh-CN"/>
+        </w:rPr>
+        <w:t xml:space="preserve">. </w:t>
       </w:r>
     </w:p>
     <w:p>
@@ -648,37 +799,409 @@
           <w:color w:val="000000" w:themeColor="text1"/>
           <w:lang w:val="en-US" w:eastAsia="zh-CN"/>
         </w:rPr>
-        <w:t>Additionally, to solve the sensor noise in Task 3, I implemented a 10-second sliding window algorithm (an array buffer</w:t>
-      </w:r>
-      <w:r>
-        <w:rPr>
-          <w:color w:val="000000" w:themeColor="text1"/>
-          <w:lang w:val="en-US" w:eastAsia="zh-CN"/>
-        </w:rPr>
-        <w:t>)</w:t>
-      </w:r>
-      <w:r>
+        <w:t xml:space="preserve">Additionally, I </w:t>
+      </w:r>
+      <w:r>
+        <w:rPr>
+          <w:rFonts w:hint="eastAsia"/>
+          <w:color w:val="000000" w:themeColor="text1"/>
+          <w:lang w:val="en-US" w:eastAsia="zh-CN"/>
+        </w:rPr>
+        <w:t>applied</w:t>
+      </w:r>
+      <w:r>
+        <w:rPr>
+          <w:color w:val="000000" w:themeColor="text1"/>
+          <w:lang w:val="en-US" w:eastAsia="zh-CN"/>
+        </w:rPr>
+        <w:t xml:space="preserve"> the </w:t>
+      </w:r>
+      <w:proofErr w:type="gramStart"/>
+      <w:r>
+        <w:rPr>
+          <w:color w:val="000000" w:themeColor="text1"/>
+          <w:lang w:val="en-US" w:eastAsia="zh-CN"/>
+        </w:rPr>
+        <w:t>floor(</w:t>
+      </w:r>
+      <w:proofErr w:type="gramEnd"/>
+      <w:r>
+        <w:rPr>
+          <w:color w:val="000000" w:themeColor="text1"/>
+          <w:lang w:val="en-US" w:eastAsia="zh-CN"/>
+        </w:rPr>
+        <w:t xml:space="preserve">) function to </w:t>
+      </w:r>
+      <w:r>
+        <w:rPr>
+          <w:rFonts w:hint="eastAsia"/>
+          <w:color w:val="000000" w:themeColor="text1"/>
+          <w:lang w:val="en-US" w:eastAsia="zh-CN"/>
+        </w:rPr>
+        <w:t>avoid tim</w:t>
+      </w:r>
+      <w:r>
+        <w:rPr>
+          <w:rFonts w:hint="eastAsia"/>
+          <w:color w:val="000000" w:themeColor="text1"/>
+          <w:lang w:val="en-US" w:eastAsia="zh-CN"/>
+        </w:rPr>
+        <w:t>ing</w:t>
+      </w:r>
+      <w:r>
+        <w:rPr>
+          <w:rFonts w:hint="eastAsia"/>
+          <w:color w:val="000000" w:themeColor="text1"/>
+          <w:lang w:val="en-US" w:eastAsia="zh-CN"/>
+        </w:rPr>
+        <w:t xml:space="preserve"> drift</w:t>
+      </w:r>
+      <w:r>
+        <w:rPr>
+          <w:color w:val="000000" w:themeColor="text1"/>
+          <w:lang w:val="en-US" w:eastAsia="zh-CN"/>
+        </w:rPr>
+        <w:t>, eliminating</w:t>
+      </w:r>
+      <w:r>
+        <w:rPr>
+          <w:rFonts w:hint="eastAsia"/>
+          <w:color w:val="000000" w:themeColor="text1"/>
+          <w:lang w:val="en-US" w:eastAsia="zh-CN"/>
+        </w:rPr>
+        <w:t xml:space="preserve"> the influence of </w:t>
+      </w:r>
+      <w:r>
+        <w:rPr>
+          <w:color w:val="000000" w:themeColor="text1"/>
+          <w:lang w:val="en-US" w:eastAsia="zh-CN"/>
+        </w:rPr>
+        <w:t>code execution delay</w:t>
+      </w:r>
+      <w:r>
+        <w:rPr>
+          <w:rFonts w:hint="eastAsia"/>
+          <w:color w:val="000000" w:themeColor="text1"/>
+          <w:lang w:val="en-US" w:eastAsia="zh-CN"/>
+        </w:rPr>
+        <w:t>ing</w:t>
+      </w:r>
+      <w:r>
+        <w:rPr>
+          <w:color w:val="000000" w:themeColor="text1"/>
+          <w:lang w:val="en-US" w:eastAsia="zh-CN"/>
+        </w:rPr>
+        <w:t>.</w:t>
+      </w:r>
+    </w:p>
+    <w:p>
+      <w:pPr>
+        <w:spacing w:line="259" w:lineRule="auto"/>
+        <w:rPr>
+          <w:color w:val="000000" w:themeColor="text1"/>
+          <w:lang w:val="en-US" w:eastAsia="zh-CN"/>
+        </w:rPr>
+      </w:pPr>
+      <w:r>
+        <w:rPr>
+          <w:color w:val="000000" w:themeColor="text1"/>
+          <w:lang w:val="en-US" w:eastAsia="zh-CN"/>
+        </w:rPr>
+        <w:t xml:space="preserve">To solve sensor noise, I </w:t>
+      </w:r>
+      <w:r>
+        <w:rPr>
+          <w:rFonts w:hint="eastAsia"/>
+          <w:color w:val="000000" w:themeColor="text1"/>
+          <w:lang w:val="en-US" w:eastAsia="zh-CN"/>
+        </w:rPr>
+        <w:t>used</w:t>
+      </w:r>
+      <w:r>
+        <w:rPr>
+          <w:color w:val="000000" w:themeColor="text1"/>
+          <w:lang w:val="en-US" w:eastAsia="zh-CN"/>
+        </w:rPr>
+        <w:t xml:space="preserve"> a sliding window algorithm. This smoothed the data, allowing for stable derivative calculations and reliable predictions. </w:t>
+      </w:r>
+    </w:p>
+    <w:p>
+      <w:pPr>
+        <w:spacing w:line="259" w:lineRule="auto"/>
+        <w:rPr>
+          <w:color w:val="000000" w:themeColor="text1"/>
+          <w:lang w:val="en-US" w:eastAsia="zh-CN"/>
+        </w:rPr>
+      </w:pPr>
+      <w:r>
+        <w:rPr>
+          <w:color w:val="000000" w:themeColor="text1"/>
+          <w:lang w:val="en-US" w:eastAsia="zh-CN"/>
+        </w:rPr>
+        <w:t>The code is also highly scalabl</w:t>
+      </w:r>
+      <w:r>
+        <w:rPr>
+          <w:rFonts w:hint="eastAsia"/>
+          <w:color w:val="000000" w:themeColor="text1"/>
+          <w:lang w:val="en-US" w:eastAsia="zh-CN"/>
+        </w:rPr>
+        <w:t xml:space="preserve">e: </w:t>
+      </w:r>
+      <w:r>
+        <w:rPr>
+          <w:color w:val="000000" w:themeColor="text1"/>
+          <w:lang w:val="en-US" w:eastAsia="zh-CN"/>
+        </w:rPr>
+        <w:t xml:space="preserve">parameters like the 0.01s loop pause or the 1s sampling interval can be easily adjusted to optimize hardware performance. </w:t>
+      </w:r>
+      <w:proofErr w:type="gramStart"/>
+      <w:r>
+        <w:rPr>
+          <w:color w:val="000000" w:themeColor="text1"/>
+          <w:lang w:val="en-US" w:eastAsia="zh-CN"/>
+        </w:rPr>
+        <w:t>A</w:t>
+      </w:r>
+      <w:r>
+        <w:rPr>
+          <w:rFonts w:hint="eastAsia"/>
+          <w:color w:val="000000" w:themeColor="text1"/>
+          <w:lang w:val="en-US" w:eastAsia="zh-CN"/>
+        </w:rPr>
+        <w:t>lso</w:t>
+      </w:r>
+      <w:proofErr w:type="gramEnd"/>
+      <w:r>
+        <w:rPr>
+          <w:rFonts w:hint="eastAsia"/>
+          <w:color w:val="000000" w:themeColor="text1"/>
+          <w:lang w:val="en-US" w:eastAsia="zh-CN"/>
+        </w:rPr>
+        <w:t xml:space="preserve"> the size of the sliding window can be adjusted to achieve </w:t>
+      </w:r>
+      <w:r>
+        <w:rPr>
+          <w:rFonts w:hint="eastAsia"/>
+          <w:color w:val="000000" w:themeColor="text1"/>
+          <w:lang w:val="en-US" w:eastAsia="zh-CN"/>
+        </w:rPr>
+        <w:t>optimal</w:t>
+      </w:r>
+      <w:r>
+        <w:rPr>
+          <w:rFonts w:hint="eastAsia"/>
+          <w:color w:val="000000" w:themeColor="text1"/>
+          <w:lang w:val="en-US" w:eastAsia="zh-CN"/>
+        </w:rPr>
+        <w:t xml:space="preserve"> </w:t>
+      </w:r>
+      <w:r>
+        <w:rPr>
+          <w:rFonts w:hint="eastAsia"/>
+          <w:color w:val="000000" w:themeColor="text1"/>
+          <w:lang w:val="en-US" w:eastAsia="zh-CN"/>
+        </w:rPr>
+        <w:t xml:space="preserve">prediction </w:t>
+      </w:r>
+      <w:r>
+        <w:rPr>
+          <w:color w:val="000000" w:themeColor="text1"/>
+          <w:lang w:val="en-US" w:eastAsia="zh-CN"/>
+        </w:rPr>
+        <w:t>performance</w:t>
+      </w:r>
+      <w:r>
+        <w:rPr>
+          <w:rFonts w:hint="eastAsia"/>
+          <w:color w:val="000000" w:themeColor="text1"/>
+          <w:lang w:val="en-US" w:eastAsia="zh-CN"/>
+        </w:rPr>
+        <w:t>.</w:t>
+      </w:r>
+    </w:p>
+    <w:p>
+      <w:pPr>
+        <w:spacing w:line="259" w:lineRule="auto"/>
+        <w:rPr>
+          <w:rFonts w:hint="eastAsia"/>
+          <w:color w:val="000000" w:themeColor="text1"/>
+          <w:lang w:val="en-US" w:eastAsia="zh-CN"/>
+        </w:rPr>
+      </w:pPr>
+      <w:r>
+        <w:rPr>
+          <w:color w:val="000000" w:themeColor="text1"/>
+          <w:lang w:val="en-US" w:eastAsia="zh-CN"/>
+        </w:rPr>
+        <w:t xml:space="preserve">Furthermore, my </w:t>
+      </w:r>
+      <w:r>
+        <w:rPr>
+          <w:rFonts w:hint="eastAsia"/>
+          <w:color w:val="000000" w:themeColor="text1"/>
+          <w:lang w:val="en-US" w:eastAsia="zh-CN"/>
+        </w:rPr>
+        <w:t>previous</w:t>
+      </w:r>
+      <w:r>
+        <w:rPr>
+          <w:color w:val="000000" w:themeColor="text1"/>
+          <w:lang w:val="en-US" w:eastAsia="zh-CN"/>
+        </w:rPr>
+        <w:t xml:space="preserve"> </w:t>
+      </w:r>
+      <w:r>
+        <w:rPr>
+          <w:rFonts w:hint="eastAsia"/>
+          <w:color w:val="000000" w:themeColor="text1"/>
+          <w:lang w:val="en-US" w:eastAsia="zh-CN"/>
+        </w:rPr>
+        <w:t xml:space="preserve">project </w:t>
+      </w:r>
+      <w:r>
+        <w:rPr>
+          <w:color w:val="000000" w:themeColor="text1"/>
+          <w:lang w:val="en-US" w:eastAsia="zh-CN"/>
+        </w:rPr>
+        <w:t xml:space="preserve">experience ensured a smooth </w:t>
+      </w:r>
+      <w:r>
+        <w:rPr>
+          <w:rFonts w:hint="eastAsia"/>
+          <w:color w:val="000000" w:themeColor="text1"/>
+          <w:lang w:val="en-US" w:eastAsia="zh-CN"/>
+        </w:rPr>
+        <w:t xml:space="preserve">initial </w:t>
+      </w:r>
+      <w:r>
+        <w:rPr>
+          <w:color w:val="000000" w:themeColor="text1"/>
+          <w:lang w:val="en-US" w:eastAsia="zh-CN"/>
+        </w:rPr>
+        <w:t xml:space="preserve">setup process, avoiding common </w:t>
+      </w:r>
+      <w:r>
+        <w:rPr>
+          <w:rFonts w:hint="eastAsia"/>
+          <w:color w:val="000000" w:themeColor="text1"/>
+          <w:lang w:val="en-US" w:eastAsia="zh-CN"/>
+        </w:rPr>
+        <w:t>problems</w:t>
+      </w:r>
+      <w:r>
+        <w:rPr>
+          <w:color w:val="000000" w:themeColor="text1"/>
+          <w:lang w:val="en-US" w:eastAsia="zh-CN"/>
+        </w:rPr>
+        <w:t xml:space="preserve"> with CH340 drivers, wiring,</w:t>
+      </w:r>
+      <w:r>
+        <w:rPr>
+          <w:rFonts w:hint="eastAsia"/>
+          <w:color w:val="000000" w:themeColor="text1"/>
+          <w:lang w:val="en-US" w:eastAsia="zh-CN"/>
+        </w:rPr>
+        <w:t xml:space="preserve"> and </w:t>
+      </w:r>
+      <w:r>
+        <w:rPr>
+          <w:rFonts w:hint="eastAsia"/>
+          <w:color w:val="000000" w:themeColor="text1"/>
+          <w:lang w:val="en-US" w:eastAsia="zh-CN"/>
+        </w:rPr>
+        <w:t>enabled</w:t>
+      </w:r>
+      <w:r>
+        <w:rPr>
+          <w:rFonts w:hint="eastAsia"/>
+          <w:color w:val="000000" w:themeColor="text1"/>
+          <w:lang w:val="en-US" w:eastAsia="zh-CN"/>
+        </w:rPr>
+        <w:t xml:space="preserve"> </w:t>
+      </w:r>
+      <w:r>
+        <w:rPr>
+          <w:color w:val="000000" w:themeColor="text1"/>
+          <w:lang w:val="en-US" w:eastAsia="zh-CN"/>
+        </w:rPr>
+        <w:t xml:space="preserve">clear </w:t>
+      </w:r>
+      <w:r>
+        <w:rPr>
+          <w:rFonts w:hint="eastAsia"/>
+          <w:color w:val="000000" w:themeColor="text1"/>
+          <w:lang w:val="en-US" w:eastAsia="zh-CN"/>
+        </w:rPr>
+        <w:t xml:space="preserve">Git </w:t>
+      </w:r>
+      <w:r>
+        <w:rPr>
+          <w:color w:val="000000" w:themeColor="text1"/>
+          <w:lang w:val="en-US" w:eastAsia="zh-CN"/>
+        </w:rPr>
+        <w:t xml:space="preserve">version </w:t>
+      </w:r>
+      <w:r>
+        <w:rPr>
+          <w:rFonts w:hint="eastAsia"/>
+          <w:color w:val="000000" w:themeColor="text1"/>
+          <w:lang w:val="en-US" w:eastAsia="zh-CN"/>
+        </w:rPr>
+        <w:t>control</w:t>
+      </w:r>
+    </w:p>
+    <w:p>
+      <w:pPr>
+        <w:spacing w:line="259" w:lineRule="auto"/>
         <w:rPr>
           <w:b/>
           <w:bCs/>
-          <w:color w:val="2B2D31"/>
-          <w:sz w:val="21"/>
-          <w:szCs w:val="21"/>
-          <w:shd w:val="clear" w:color="auto" w:fill="FFFFFF"/>
-        </w:rPr>
-        <w:t>,</w:t>
-      </w:r>
-      <w:r>
-        <w:rPr>
-          <w:rFonts w:hint="eastAsia"/>
+          <w:color w:val="000000" w:themeColor="text1"/>
+          <w:lang w:val="en-US" w:eastAsia="zh-CN"/>
+        </w:rPr>
+      </w:pPr>
+      <w:r>
+        <w:rPr>
           <w:b/>
           <w:bCs/>
-          <w:color w:val="2B2D31"/>
-          <w:sz w:val="21"/>
-          <w:szCs w:val="21"/>
-          <w:shd w:val="clear" w:color="auto" w:fill="FFFFFF"/>
+          <w:color w:val="000000" w:themeColor="text1"/>
+          <w:lang w:val="en-US" w:eastAsia="zh-CN"/>
+        </w:rPr>
+        <w:t>Limitations:</w:t>
+      </w:r>
+    </w:p>
+    <w:p>
+      <w:pPr>
+        <w:spacing w:line="259" w:lineRule="auto"/>
+        <w:rPr>
+          <w:rFonts w:hint="eastAsia"/>
+          <w:color w:val="000000" w:themeColor="text1"/>
           <w:lang w:eastAsia="zh-CN"/>
         </w:rPr>
+      </w:pPr>
+      <w:r>
+        <w:rPr>
+          <w:color w:val="000000" w:themeColor="text1"/>
+          <w:lang w:val="en-US" w:eastAsia="zh-CN"/>
+        </w:rPr>
+        <w:t>B</w:t>
+      </w:r>
+      <w:proofErr w:type="spellStart"/>
+      <w:r>
+        <w:rPr>
+          <w:color w:val="000000" w:themeColor="text1"/>
+          <w:lang w:eastAsia="zh-CN"/>
+        </w:rPr>
+        <w:t>ecause</w:t>
+      </w:r>
+      <w:proofErr w:type="spellEnd"/>
+      <w:r>
+        <w:rPr>
+          <w:rFonts w:hint="eastAsia"/>
+          <w:color w:val="000000" w:themeColor="text1"/>
+          <w:lang w:eastAsia="zh-CN"/>
+        </w:rPr>
         <w:t xml:space="preserve"> </w:t>
       </w:r>
       <w:r>
@@ -686,20 +1209,128 @@
           <w:color w:val="000000" w:themeColor="text1"/>
           <w:lang w:eastAsia="zh-CN"/>
         </w:rPr>
-        <w:t>whose size can be easily adjusted to achieve optimum performance in different environments</w:t>
-      </w:r>
-      <w:r>
-        <w:rPr>
-          <w:color w:val="000000" w:themeColor="text1"/>
-          <w:lang w:val="en-US" w:eastAsia="zh-CN"/>
-        </w:rPr>
-        <w:t>. This smoothed the raw data perfectly, allowing my program to calculate a stable rate of change and make reliable 5-minute predictions.</w:t>
+        <w:t>the blinking is tied to a fixed timer</w:t>
+      </w:r>
+      <w:r>
+        <w:rPr>
+          <w:rFonts w:hint="eastAsia"/>
+          <w:color w:val="000000" w:themeColor="text1"/>
+          <w:lang w:eastAsia="zh-CN"/>
+        </w:rPr>
+        <w:t xml:space="preserve"> </w:t>
+      </w:r>
+      <w:r>
+        <w:rPr>
+          <w:color w:val="000000" w:themeColor="text1"/>
+          <w:lang w:eastAsia="zh-CN"/>
+        </w:rPr>
+        <w:t>rather than being synchronized with the exact moment the temperature crosses the threshold</w:t>
+      </w:r>
+      <w:r>
+        <w:rPr>
+          <w:color w:val="000000" w:themeColor="text1"/>
+          <w:lang w:eastAsia="zh-CN"/>
+        </w:rPr>
+        <w:t xml:space="preserve">, the </w:t>
+      </w:r>
+      <w:r>
+        <w:rPr>
+          <w:rFonts w:hint="eastAsia"/>
+          <w:color w:val="000000" w:themeColor="text1"/>
+          <w:lang w:eastAsia="zh-CN"/>
+        </w:rPr>
+        <w:t xml:space="preserve">correct </w:t>
+      </w:r>
+      <w:r>
+        <w:rPr>
+          <w:color w:val="000000" w:themeColor="text1"/>
+          <w:lang w:eastAsia="zh-CN"/>
+        </w:rPr>
+        <w:t>LED might not light up instantl</w:t>
+      </w:r>
+      <w:r>
+        <w:rPr>
+          <w:rFonts w:hint="eastAsia"/>
+          <w:color w:val="000000" w:themeColor="text1"/>
+          <w:lang w:eastAsia="zh-CN"/>
+        </w:rPr>
+        <w:t>y.</w:t>
       </w:r>
     </w:p>
     <w:p>
       <w:pPr>
         <w:spacing w:line="259" w:lineRule="auto"/>
-        <w:jc w:val="both"/>
+        <w:rPr>
+          <w:color w:val="000000" w:themeColor="text1"/>
+          <w:lang w:val="en-US" w:eastAsia="zh-CN"/>
+        </w:rPr>
+      </w:pPr>
+      <w:r>
+        <w:rPr>
+          <w:color w:val="000000" w:themeColor="text1"/>
+          <w:lang w:val="en-US" w:eastAsia="zh-CN"/>
+        </w:rPr>
+        <w:t xml:space="preserve">One </w:t>
+      </w:r>
+      <w:r>
+        <w:rPr>
+          <w:rFonts w:hint="eastAsia"/>
+          <w:color w:val="000000" w:themeColor="text1"/>
+          <w:lang w:val="en-US" w:eastAsia="zh-CN"/>
+        </w:rPr>
+        <w:t xml:space="preserve">another </w:t>
+      </w:r>
+      <w:r>
+        <w:rPr>
+          <w:color w:val="000000" w:themeColor="text1"/>
+          <w:lang w:val="en-US" w:eastAsia="zh-CN"/>
+        </w:rPr>
+        <w:t>limitation is that the prediction algorithm assumes temperature changes linearly over 5 minutes. In real thermodynamic systems, temperature changes often follow exponential curves, meaning linear calculations might overestimate the final values.</w:t>
+      </w:r>
+    </w:p>
+    <w:p>
+      <w:pPr>
+        <w:spacing w:line="259" w:lineRule="auto"/>
+        <w:rPr>
+          <w:color w:val="000000" w:themeColor="text1"/>
+          <w:lang w:val="en-US" w:eastAsia="zh-CN"/>
+        </w:rPr>
+      </w:pPr>
+      <w:r>
+        <w:rPr>
+          <w:rFonts w:hint="eastAsia"/>
+          <w:color w:val="000000" w:themeColor="text1"/>
+          <w:lang w:val="en-US" w:eastAsia="zh-CN"/>
+        </w:rPr>
+        <w:t>Additionally</w:t>
+      </w:r>
+      <w:r>
+        <w:rPr>
+          <w:color w:val="000000" w:themeColor="text1"/>
+          <w:lang w:val="en-US" w:eastAsia="zh-CN"/>
+        </w:rPr>
+        <w:t xml:space="preserve">, the MCP9700A thermistor has electrical noise. </w:t>
+      </w:r>
+    </w:p>
+    <w:p>
+      <w:pPr>
+        <w:spacing w:line="259" w:lineRule="auto"/>
+        <w:rPr>
+          <w:color w:val="000000" w:themeColor="text1"/>
+          <w:lang w:val="en-US" w:eastAsia="zh-CN"/>
+        </w:rPr>
+      </w:pPr>
+      <w:r>
+        <w:rPr>
+          <w:color w:val="000000" w:themeColor="text1"/>
+          <w:lang w:val="en-US" w:eastAsia="zh-CN"/>
+        </w:rPr>
+        <w:t>Finally, relying on a breadboard introduces parasitic resistance and loose connections, lacking the physical robustness required for a real aerospace environment.</w:t>
+      </w:r>
+    </w:p>
+    <w:p>
+      <w:pPr>
+        <w:spacing w:line="259" w:lineRule="auto"/>
         <w:rPr>
           <w:b/>
           <w:bCs/>
@@ -714,7 +1345,7 @@
           <w:color w:val="000000" w:themeColor="text1"/>
           <w:lang w:val="en-US" w:eastAsia="zh-CN"/>
         </w:rPr>
-        <w:t>Limitations:</w:t>
+        <w:t>Suggested Future Improvements:</w:t>
       </w:r>
     </w:p>
     <w:p>
@@ -730,7 +1361,40 @@
           <w:color w:val="000000" w:themeColor="text1"/>
           <w:lang w:val="en-US" w:eastAsia="zh-CN"/>
         </w:rPr>
-        <w:t xml:space="preserve">One main limitation of my code is that the prediction algorithm assumes the temperature will change linearly at a constant rate over the next 5 minutes. However, in real thermodynamic systems, temperature changes often follow exponential or logarithmic curves, meaning my current linear calculation might overestimate the final temperature. </w:t>
+        <w:t xml:space="preserve">Replacing the analog thermistor with a high-precision digital sensor, and using </w:t>
+      </w:r>
+      <w:proofErr w:type="spellStart"/>
+      <w:proofErr w:type="gramStart"/>
+      <w:r>
+        <w:rPr>
+          <w:color w:val="000000" w:themeColor="text1"/>
+          <w:lang w:val="en-US" w:eastAsia="zh-CN"/>
+        </w:rPr>
+        <w:t>a</w:t>
+      </w:r>
+      <w:proofErr w:type="spellEnd"/>
+      <w:proofErr w:type="gramEnd"/>
+      <w:r>
+        <w:rPr>
+          <w:color w:val="000000" w:themeColor="text1"/>
+          <w:lang w:val="en-US" w:eastAsia="zh-CN"/>
+        </w:rPr>
+        <w:t xml:space="preserve"> </w:t>
+      </w:r>
+      <w:r>
+        <w:rPr>
+          <w:rFonts w:hint="eastAsia"/>
+          <w:color w:val="000000" w:themeColor="text1"/>
+          <w:lang w:val="en-US" w:eastAsia="zh-CN"/>
+        </w:rPr>
+        <w:t xml:space="preserve">integrated </w:t>
+      </w:r>
+      <w:r>
+        <w:rPr>
+          <w:color w:val="000000" w:themeColor="text1"/>
+          <w:lang w:val="en-US" w:eastAsia="zh-CN"/>
+        </w:rPr>
+        <w:t>PCB instead of a breadboard, would significantly reduce signal noise.</w:t>
       </w:r>
     </w:p>
     <w:p>
@@ -746,71 +1410,110 @@
           <w:color w:val="000000" w:themeColor="text1"/>
           <w:lang w:val="en-US" w:eastAsia="zh-CN"/>
         </w:rPr>
-        <w:t>Furthermore, the MCP9700A thermistor has inherent electrical noise, limiting the ultimate precision of the readings.</w:t>
+        <w:t xml:space="preserve">Moreover, instead of simple linear </w:t>
+      </w:r>
+      <w:r>
+        <w:rPr>
+          <w:rFonts w:hint="eastAsia"/>
+          <w:color w:val="000000" w:themeColor="text1"/>
+          <w:lang w:val="en-US" w:eastAsia="zh-CN"/>
+        </w:rPr>
+        <w:t>prediction</w:t>
+      </w:r>
+      <w:r>
+        <w:rPr>
+          <w:color w:val="000000" w:themeColor="text1"/>
+          <w:lang w:val="en-US" w:eastAsia="zh-CN"/>
+        </w:rPr>
+        <w:t>, I could collect real-world thermal data to establish an empirical curve</w:t>
+      </w:r>
+      <w:r>
+        <w:rPr>
+          <w:rFonts w:hint="eastAsia"/>
+          <w:color w:val="000000" w:themeColor="text1"/>
+          <w:lang w:val="en-US" w:eastAsia="zh-CN"/>
+        </w:rPr>
+        <w:t xml:space="preserve">, or by directly using </w:t>
+      </w:r>
+      <w:r>
+        <w:rPr>
+          <w:color w:val="000000" w:themeColor="text1"/>
+          <w:lang w:val="en-US" w:eastAsia="zh-CN"/>
+        </w:rPr>
+        <w:t>thermo</w:t>
+      </w:r>
+      <w:r>
+        <w:rPr>
+          <w:rFonts w:hint="eastAsia"/>
+          <w:color w:val="000000" w:themeColor="text1"/>
+          <w:lang w:val="en-US" w:eastAsia="zh-CN"/>
+        </w:rPr>
+        <w:t>dynamic formula to predict the temperature</w:t>
+      </w:r>
+      <w:r>
+        <w:rPr>
+          <w:rFonts w:hint="eastAsia"/>
+          <w:color w:val="000000" w:themeColor="text1"/>
+          <w:lang w:val="en-US" w:eastAsia="zh-CN"/>
+        </w:rPr>
+        <w:t>，</w:t>
+      </w:r>
+      <w:r>
+        <w:rPr>
+          <w:rFonts w:hint="eastAsia"/>
+          <w:color w:val="000000" w:themeColor="text1"/>
+          <w:lang w:val="en-US" w:eastAsia="zh-CN"/>
+        </w:rPr>
+        <w:t xml:space="preserve">even </w:t>
+      </w:r>
+      <w:r>
+        <w:rPr>
+          <w:color w:val="000000" w:themeColor="text1"/>
+          <w:lang w:val="en-US" w:eastAsia="zh-CN"/>
+        </w:rPr>
+        <w:t>introducing advanced algorithms like a Kalman filter, the system could achieve highly accurate future temperature predictions.</w:t>
       </w:r>
     </w:p>
     <w:p>
       <w:pPr>
         <w:spacing w:line="259" w:lineRule="auto"/>
-        <w:jc w:val="both"/>
-        <w:rPr>
-          <w:b/>
-          <w:bCs/>
-          <w:color w:val="000000" w:themeColor="text1"/>
-          <w:lang w:val="en-US" w:eastAsia="zh-CN"/>
-        </w:rPr>
-      </w:pPr>
-      <w:r>
-        <w:rPr>
-          <w:b/>
-          <w:bCs/>
-          <w:color w:val="000000" w:themeColor="text1"/>
-          <w:lang w:val="en-US" w:eastAsia="zh-CN"/>
-        </w:rPr>
-        <w:t>Suggested Future Improvements:</w:t>
-      </w:r>
-    </w:p>
-    <w:p>
-      <w:pPr>
-        <w:spacing w:line="259" w:lineRule="auto"/>
-        <w:rPr>
-          <w:color w:val="000000" w:themeColor="text1"/>
-          <w:lang w:val="en-US" w:eastAsia="zh-CN"/>
-        </w:rPr>
-      </w:pPr>
-      <w:r>
-        <w:rPr>
-          <w:color w:val="000000" w:themeColor="text1"/>
-          <w:lang w:val="en-US" w:eastAsia="zh-CN"/>
-        </w:rPr>
-        <w:t xml:space="preserve">If I were to improve this project, replacing the analog thermistor with a high-precision digital sensor would be the first step to reduce signal noise. </w:t>
-      </w:r>
-    </w:p>
-    <w:p>
-      <w:pPr>
-        <w:spacing w:line="259" w:lineRule="auto"/>
-        <w:rPr>
-          <w:color w:val="000000" w:themeColor="text1"/>
-          <w:lang w:val="en-US" w:eastAsia="zh-CN"/>
-        </w:rPr>
-      </w:pPr>
-      <w:r>
-        <w:rPr>
-          <w:color w:val="000000" w:themeColor="text1"/>
-          <w:lang w:val="en-US" w:eastAsia="zh-CN"/>
-        </w:rPr>
-        <w:t>Moreover, instead of a simple linear extrapolation, I could collect a large amount of real temperature-changing data to establish an empirical curve. By matching current readings to this curve, or by introducing advanced algorithms like a Kalman Filter, the system could achieve much more accurate future temperature predictions.</w:t>
-      </w:r>
-    </w:p>
-    <w:p>
-      <w:pPr>
-        <w:spacing w:line="259" w:lineRule="auto"/>
-        <w:jc w:val="both"/>
-        <w:rPr>
-          <w:color w:val="000000" w:themeColor="text1"/>
-          <w:lang w:eastAsia="zh-CN"/>
-        </w:rPr>
-      </w:pPr>
+        <w:rPr>
+          <w:rFonts w:hint="eastAsia"/>
+          <w:color w:val="000000" w:themeColor="text1"/>
+          <w:lang w:val="en-US" w:eastAsia="zh-CN"/>
+        </w:rPr>
+      </w:pPr>
+      <w:r>
+        <w:rPr>
+          <w:rFonts w:hint="eastAsia"/>
+          <w:color w:val="000000" w:themeColor="text1"/>
+          <w:lang w:val="en-US" w:eastAsia="zh-CN"/>
+        </w:rPr>
+        <w:t xml:space="preserve">In addition, the algorithm may </w:t>
+      </w:r>
+      <w:r>
+        <w:rPr>
+          <w:color w:val="000000" w:themeColor="text1"/>
+          <w:lang w:val="en-US" w:eastAsia="zh-CN"/>
+        </w:rPr>
+        <w:t>iterate</w:t>
+      </w:r>
+      <w:r>
+        <w:rPr>
+          <w:rFonts w:hint="eastAsia"/>
+          <w:color w:val="000000" w:themeColor="text1"/>
+          <w:lang w:val="en-US" w:eastAsia="zh-CN"/>
+        </w:rPr>
+        <w:t xml:space="preserve"> to eliminate the </w:t>
+      </w:r>
+      <w:r>
+        <w:rPr>
+          <w:rFonts w:hint="eastAsia"/>
+          <w:color w:val="000000" w:themeColor="text1"/>
+          <w:lang w:val="en-US" w:eastAsia="zh-CN"/>
+        </w:rPr>
+        <w:t>influence of fixed timer</w:t>
+      </w:r>
     </w:p>
     <w:sectPr>
       <w:headerReference w:type="even" r:id="rId13"/>

</xml_diff>